<commit_message>
Revisa a apresentação de qualificação (30 lâminas) e o roteiro de 25 minutos
Capa com a fachada da escola; objetivos no texto original, com verbos no
infinitivo; nova lâmina de relevâncias; contribuições da RSL para as decisões
da tese; fundamentos teóricos reduzidos a três lâminas, do texto ao ato; mapa
das políticas por país com o foco de cada uma e lâmina sobre o que a
comparação traz para a tese; referências ao final.

Co-Authored-By: Claude Opus 5.5 <noreply@anthropic.com>
Claude-Session: https://claude.ai/code/session_01HxStpW4pQoDfJdTDYr6zEC
</commit_message>
<xml_diff>
--- a/apresentacao_qualificacao/ROTEIRO_DE_FALA_25min.docx
+++ b/apresentacao_qualificacao/ROTEIRO_DE_FALA_25min.docx
@@ -28,7 +28,7 @@
       <w:r>
         <w:t>Yzynya Silva Rezende Machado · Orientadora: Profa. Dra. Maria Cristina Leandro de Paiva</w:t>
         <w:br/>
-        <w:t>Apresentação: Qualificacao_PNED_Pipa.pptx (35 lâminas) · Duração prevista: 25 minutos</w:t>
+        <w:t>Apresentação: Qualificacao_PNED_Pipa.pptx (30 lâminas, das quais as duas últimas são de referências) · Duração prevista: 25 minutos</w:t>
       </w:r>
     </w:p>
     <w:p>
@@ -44,7 +44,7 @@
         <w:pStyle w:val="ListBullet"/>
       </w:pPr>
       <w:r>
-        <w:t>O texto tem 2999 palavras, o que dá cerca de 24 minutos de fala a 125 palavras por minuto, ritmo pausado. O minuto restante fica para as trocas de lâmina e as pausas. Se o ensaio cronometrado der mais de 26 minutos, use os cortes sugeridos no fim do documento.</w:t>
+        <w:t>O texto tem 2937 palavras, o que dá cerca de 23 minutos de fala a 125 palavras por minuto, ritmo pausado. Os 2 minutos restantes ficam para as trocas de lâmina, as pausas e o tempo de apontar fotos e mapa. Se o ensaio cronometrado der mais de 26 minutos, use os cortes sugeridos no fim do documento.</w:t>
       </w:r>
     </w:p>
     <w:p>
@@ -52,7 +52,7 @@
         <w:pStyle w:val="ListBullet"/>
       </w:pPr>
       <w:r>
-        <w:t>Cada lâmina traz o tempo previsto e o tempo acumulado ao final dela. Os três pontos de controle mais úteis são: fim da lâmina 10 por volta de 08:10, fim da lâmina 18 por volta de 14:25 e fim da lâmina 26 por volta de 19:20.</w:t>
+        <w:t>Cada lâmina traz o tempo previsto e o tempo acumulado ao final dela. Os três pontos de controle mais úteis são: fim da lâmina 11 por volta de 09:50, fim da lâmina 18 por volta de 16:25 e fim da lâmina 25 por volta de 22:50.</w:t>
       </w:r>
     </w:p>
     <w:p>
@@ -202,7 +202,7 @@
           </w:tcPr>
           <w:p>
             <w:r>
-              <w:t>Objeto, questão e objetivos</w:t>
+              <w:t>Objeto, questão, objetivos e relevâncias</w:t>
             </w:r>
           </w:p>
         </w:tc>
@@ -212,7 +212,7 @@
           </w:tcPr>
           <w:p>
             <w:r>
-              <w:t>3-7</w:t>
+              <w:t>3-8</w:t>
             </w:r>
           </w:p>
         </w:tc>
@@ -222,7 +222,7 @@
           </w:tcPr>
           <w:p>
             <w:r>
-              <w:t>05:00</w:t>
+              <w:t>06:20</w:t>
             </w:r>
           </w:p>
         </w:tc>
@@ -232,7 +232,7 @@
           </w:tcPr>
           <w:p>
             <w:r>
-              <w:t>05:55</w:t>
+              <w:t>07:15</w:t>
             </w:r>
           </w:p>
         </w:tc>
@@ -254,7 +254,7 @@
           </w:tcPr>
           <w:p>
             <w:r>
-              <w:t>8-10</w:t>
+              <w:t>9-11</w:t>
             </w:r>
           </w:p>
         </w:tc>
@@ -264,7 +264,7 @@
           </w:tcPr>
           <w:p>
             <w:r>
-              <w:t>02:15</w:t>
+              <w:t>02:35</w:t>
             </w:r>
           </w:p>
         </w:tc>
@@ -274,7 +274,7 @@
           </w:tcPr>
           <w:p>
             <w:r>
-              <w:t>08:10</w:t>
+              <w:t>09:50</w:t>
             </w:r>
           </w:p>
         </w:tc>
@@ -296,7 +296,7 @@
           </w:tcPr>
           <w:p>
             <w:r>
-              <w:t>11-18</w:t>
+              <w:t>12-15</w:t>
             </w:r>
           </w:p>
         </w:tc>
@@ -306,7 +306,7 @@
           </w:tcPr>
           <w:p>
             <w:r>
-              <w:t>06:15</w:t>
+              <w:t>04:25</w:t>
             </w:r>
           </w:p>
         </w:tc>
@@ -316,7 +316,7 @@
           </w:tcPr>
           <w:p>
             <w:r>
-              <w:t>14:25</w:t>
+              <w:t>14:15</w:t>
             </w:r>
           </w:p>
         </w:tc>
@@ -338,7 +338,7 @@
           </w:tcPr>
           <w:p>
             <w:r>
-              <w:t>19-23</w:t>
+              <w:t>16-18</w:t>
             </w:r>
           </w:p>
         </w:tc>
@@ -348,7 +348,7 @@
           </w:tcPr>
           <w:p>
             <w:r>
-              <w:t>03:00</w:t>
+              <w:t>02:10</w:t>
             </w:r>
           </w:p>
         </w:tc>
@@ -358,7 +358,7 @@
           </w:tcPr>
           <w:p>
             <w:r>
-              <w:t>17:25</w:t>
+              <w:t>16:25</w:t>
             </w:r>
           </w:p>
         </w:tc>
@@ -380,7 +380,7 @@
           </w:tcPr>
           <w:p>
             <w:r>
-              <w:t>24-26</w:t>
+              <w:t>19-22</w:t>
             </w:r>
           </w:p>
         </w:tc>
@@ -390,7 +390,7 @@
           </w:tcPr>
           <w:p>
             <w:r>
-              <w:t>01:55</w:t>
+              <w:t>04:00</w:t>
             </w:r>
           </w:p>
         </w:tc>
@@ -400,7 +400,7 @@
           </w:tcPr>
           <w:p>
             <w:r>
-              <w:t>19:20</w:t>
+              <w:t>20:25</w:t>
             </w:r>
           </w:p>
         </w:tc>
@@ -422,7 +422,7 @@
           </w:tcPr>
           <w:p>
             <w:r>
-              <w:t>27-31</w:t>
+              <w:t>23-25</w:t>
             </w:r>
           </w:p>
         </w:tc>
@@ -432,7 +432,7 @@
           </w:tcPr>
           <w:p>
             <w:r>
-              <w:t>03:15</w:t>
+              <w:t>02:25</w:t>
             </w:r>
           </w:p>
         </w:tc>
@@ -442,7 +442,7 @@
           </w:tcPr>
           <w:p>
             <w:r>
-              <w:t>22:35</w:t>
+              <w:t>22:50</w:t>
             </w:r>
           </w:p>
         </w:tc>
@@ -464,7 +464,7 @@
           </w:tcPr>
           <w:p>
             <w:r>
-              <w:t>32-35</w:t>
+              <w:t>26-28</w:t>
             </w:r>
           </w:p>
         </w:tc>
@@ -474,7 +474,49 @@
           </w:tcPr>
           <w:p>
             <w:r>
-              <w:t>02:25</w:t>
+              <w:t>02:10</w:t>
+            </w:r>
+          </w:p>
+        </w:tc>
+        <w:tc>
+          <w:tcPr>
+            <w:tcW w:type="dxa" w:w="2351"/>
+          </w:tcPr>
+          <w:p>
+            <w:r>
+              <w:t>25:00</w:t>
+            </w:r>
+          </w:p>
+        </w:tc>
+      </w:tr>
+      <w:tr>
+        <w:tc>
+          <w:tcPr>
+            <w:tcW w:type="dxa" w:w="2351"/>
+          </w:tcPr>
+          <w:p>
+            <w:r>
+              <w:t>Referências</w:t>
+            </w:r>
+          </w:p>
+        </w:tc>
+        <w:tc>
+          <w:tcPr>
+            <w:tcW w:type="dxa" w:w="2351"/>
+          </w:tcPr>
+          <w:p>
+            <w:r>
+              <w:t>29-30</w:t>
+            </w:r>
+          </w:p>
+        </w:tc>
+        <w:tc>
+          <w:tcPr>
+            <w:tcW w:type="dxa" w:w="2351"/>
+          </w:tcPr>
+          <w:p>
+            <w:r>
+              <w:t>00:00</w:t>
             </w:r>
           </w:p>
         </w:tc>
@@ -514,7 +556,7 @@
               <w:rPr>
                 <w:b/>
               </w:rPr>
-              <w:t>1-35</w:t>
+              <w:t>1-30</w:t>
             </w:r>
           </w:p>
         </w:tc>
@@ -581,11 +623,20 @@
       </w:r>
     </w:p>
     <w:p>
+      <w:r>
+        <w:rPr>
+          <w:i/>
+          <w:color w:val="555555"/>
+        </w:rPr>
+        <w:t>[Apontar a foto da fachada ao dizer o nome da escola.]</w:t>
+      </w:r>
+    </w:p>
+    <w:p>
       <w:pPr>
         <w:jc w:val="both"/>
       </w:pPr>
       <w:r>
-        <w:t>Bom dia (ou boa tarde) a todas e a todos. Agradeço à banca pela leitura cuidadosa do texto e à professora Maria Cristina Leandro de Paiva pela orientação. Apresento hoje o projeto de tese A encenação da PNED em Pipa/RN: culturas profissionais, território e resistências no contexto da prática. Nos próximos vinte e cinco minutos, quero mostrar o problema, o caminho teórico e metodológico e o que os capítulos já escritos permitem afirmar.</w:t>
+        <w:t>Bom dia (ou boa tarde) a todas e a todos. Agradeço à banca pela leitura cuidadosa do texto e à professora Maria Cristina Leandro de Paiva pela orientação. Apresento o projeto de tese A encenação da PNED em Pipa/RN: culturas profissionais, território e resistências no contexto da prática. A fotografia é da entrada da Escola Municipal Domitila Castelo da Silva, onde a pesquisa acontece.</w:t>
       </w:r>
     </w:p>
     <w:p>
@@ -627,7 +678,7 @@
         <w:pStyle w:val="Heading1"/>
       </w:pPr>
       <w:r>
-        <w:t>OBJETO, QUESTÃO E OBJETIVOS</w:t>
+        <w:t>OBJETO, QUESTÃO, OBJETIVOS E RELEVÂNCIAS</w:t>
       </w:r>
     </w:p>
     <w:p>
@@ -652,7 +703,7 @@
         <w:jc w:val="both"/>
       </w:pPr>
       <w:r>
-        <w:t>O objeto desta tese é a Política Nacional de Educação Digital, instituída pela Lei nº 14.533, de 2023, no eixo que chega às escolas, a Educação Digital Escolar. Interessa-me o modo como os profissionais da educação interpretam, traduzem e recontextualizam essa política nos anos iniciais, do 1º ao 5º ano, da Escola Municipal Domitila Castelo da Silva, em Pipa, distrito de Tibau do Sul. Chamo de profissionais da educação todas as pessoas que, na escola, participam da construção da política: professoras e professores, coordenação pedagógica, direção e demais profissionais ligados aos processos pedagógicos ou à educação digital. A sala de aula é um dos lugares em que a política ganha forma, ao lado do planejamento, dos registros e das conversas entre colegas. Por isso trabalho com a ideia de Ball, Maguire e Braun de que as atuações são coletivas, criativas e limitadas. A pergunta nasceu da convivência com esse território, onde trabalho há dezoito anos na rede municipal.</w:t>
+        <w:t>O objeto desta tese é a Política Nacional de Educação Digital, instituída pela Lei nº 14.533, de 2023, no eixo que chega às escolas, a Educação Digital Escolar. Interessa-me o modo como os profissionais da educação interpretam, traduzem e recontextualizam essa política nos anos iniciais, do 1º ao 5º ano, da Escola Municipal Domitila Castelo da Silva, em Pipa, distrito de Tibau do Sul. Chamo de profissionais da educação todas as pessoas que, na escola, participam da construção da política: professoras e professores, coordenação pedagógica, direção e demais profissionais ligados aos processos pedagógicos ou à educação digital. Trabalho com a ideia de Ball, Maguire e Braun de que as atuações são coletivas, criativas e limitadas. A pergunta nasceu da convivência com esse território, onde trabalho há dezoito anos na rede municipal.</w:t>
       </w:r>
     </w:p>
     <w:p>
@@ -703,7 +754,16 @@
           <w:color w:val="666666"/>
           <w:sz w:val="20"/>
         </w:rPr>
-        <w:t>70 s  ·  ao final: 04:15</w:t>
+        <w:t>90 s  ·  ao final: 04:35</w:t>
+      </w:r>
+    </w:p>
+    <w:p>
+      <w:r>
+        <w:rPr>
+          <w:i/>
+          <w:color w:val="555555"/>
+        </w:rPr>
+        <w:t>[Destacar o verbo de cada objetivo: compreender, analisar, identificar, discutir.]</w:t>
       </w:r>
     </w:p>
     <w:p>
@@ -711,7 +771,7 @@
         <w:jc w:val="both"/>
       </w:pPr>
       <w:r>
-        <w:t>O objetivo geral é analisar como os profissionais da educação encenam e recontextualizam a PNED no contexto da prática da escola, considerando as relações entre a política, as culturas profissionais, as condições materiais e institucionais e as especificidades do território. Os quatro objetivos específicos acompanham o caminho que a política percorre até as crianças. O primeiro se detém na interpretação, isto é, em como os profissionais leem a política a partir de suas experiências, crenças, valores e formas de trabalho. O segundo leva essa leitura às condições da escola e do território, e é nele que Pipa entra como dimensão do contexto. O terceiro pergunta o que os profissionais efetivamente fazem com a PNED, sem definir antes qual forma de atuação deve prevalecer. O quarto chega às crianças e às possibilidades de provisão, proteção e participação no ambiente digital, nos termos do Comentário Geral nº 25 da ONU.</w:t>
+        <w:t>O objetivo geral é analisar como os profissionais da educação encenam e recontextualizam a Política Nacional de Educação Digital no contexto da prática da Escola Municipal Domitila Castelo da Silva, em Pipa, considerando as relações entre a política, as culturas profissionais, as condições materiais e institucionais da escola e as especificidades socioespaciais do território. Os objetivos específicos acompanham o caminho que a política percorre até as crianças. O primeiro é compreender como os diferentes profissionais da educação interpretam os textos da PNED e os discursos sobre educação digital, considerando suas experiências, crenças, valores e formas de organização do trabalho. O segundo, analisar como as condições materiais e institucionais da escola, articuladas às especificidades socioespaciais do território, atravessam a tradução e a recontextualização da PNED em ações, escolhas e práticas cotidianas. O terceiro, identificar as diferentes formas de atuação produzidas diante da política, com atenção às situações em que emergem adesão, acomodação, adaptação, omissão seletiva, negociação, ressignificação ou resistência. O quarto, discutir as implicações dessas formas de encenação para a educação digital das crianças, considerando a provisão, a proteção e a participação no ambiente digital.</w:t>
       </w:r>
     </w:p>
     <w:p>
@@ -728,7 +788,7 @@
           <w:color w:val="666666"/>
           <w:sz w:val="20"/>
         </w:rPr>
-        <w:t>50 s  ·  ao final: 05:05</w:t>
+        <w:t>50 s  ·  ao final: 05:25</w:t>
       </w:r>
     </w:p>
     <w:p>
@@ -753,7 +813,7 @@
         <w:pStyle w:val="Heading2"/>
       </w:pPr>
       <w:r>
-        <w:t>Lâmina 7 · Ineditismo</w:t>
+        <w:t>Lâmina 7 · Relevâncias da pesquisa</w:t>
       </w:r>
     </w:p>
     <w:p>
@@ -762,7 +822,7 @@
           <w:color w:val="666666"/>
           <w:sz w:val="20"/>
         </w:rPr>
-        <w:t>50 s  ·  ao final: 05:55</w:t>
+        <w:t>60 s  ·  ao final: 06:25</w:t>
       </w:r>
     </w:p>
     <w:p>
@@ -770,7 +830,32 @@
         <w:jc w:val="both"/>
       </w:pPr>
       <w:r>
-        <w:t>O ineditismo aparece em três planos. No empírico-temporal, acompanhamos a chegada da PNED à escola enquanto ela acontece: nenhum dos nove estudos reunidos na revisão examina essa política, e nenhum investiga uma rede municipal de pequeno porte. No analítico-espacial, Pipa entra como parte do contexto da prática, lida com Milton Santos, para quem a categoria de análise é o território usado, e com Doreen Massey, que pensa o lugar como encontro de trajetórias. No teórico-conceitual, articulamos atuação, culturas profissionais, materialidade e território, e dessa articulação nasce a formulação habitar o digital, que apresento adiante.</w:t>
+        <w:t>Vejo cinco relevâncias nesta pesquisa. Para as crianças, porque o eixo lhes promete participação consciente e democrática e proteção dos dados, e, nos anos iniciais, a escola pode ser o primeiro espaço público em que o digital é discutido com alguém responsável pelo ensino. Para os profissionais, porque olhamos a política a partir de quem a faz acontecer, sem cobrar de cada um o que só o desenho da política poderia garantir. Para o território, porque em Pipa o mesmo distrito reúne uso econômico intenso das tecnologias e salas de aula sem telas. Para a ciência, porque a PNED é lida pelo contexto da prática, com contribuições às políticas educacionais, à educação digital e aos direitos das crianças. E para a rede, que receberá a devolutiva dos resultados.</w:t>
+      </w:r>
+    </w:p>
+    <w:p>
+      <w:pPr>
+        <w:pStyle w:val="Heading2"/>
+      </w:pPr>
+      <w:r>
+        <w:t>Lâmina 8 · Ineditismo</w:t>
+      </w:r>
+    </w:p>
+    <w:p>
+      <w:r>
+        <w:rPr>
+          <w:color w:val="666666"/>
+          <w:sz w:val="20"/>
+        </w:rPr>
+        <w:t>50 s  ·  ao final: 07:15</w:t>
+      </w:r>
+    </w:p>
+    <w:p>
+      <w:pPr>
+        <w:jc w:val="both"/>
+      </w:pPr>
+      <w:r>
+        <w:t>O ineditismo aparece em três planos. No empírico-temporal, acompanhamos a chegada da PNED à escola enquanto ela acontece: nenhum dos nove estudos reunidos na revisão examina essa política, e nenhum investiga uma rede municipal de pequeno porte. No analítico-espacial, Pipa entra como parte do contexto da prática, lida com Milton Santos, para quem a categoria de análise é o território usado, e com Doreen Massey, que pensa o lugar como encontro de trajetórias. No teórico-conceitual, articulamos atuação, culturas profissionais, materialidade e território, e dessa articulação nasce a formulação habitar o digital.</w:t>
       </w:r>
     </w:p>
     <w:p>
@@ -786,7 +871,7 @@
         <w:pStyle w:val="Heading2"/>
       </w:pPr>
       <w:r>
-        <w:t>Lâmina 8 · Divisor: Revisão sistemática</w:t>
+        <w:t>Lâmina 9 · Divisor: Revisão sistemática</w:t>
       </w:r>
     </w:p>
     <w:p>
@@ -795,7 +880,7 @@
           <w:color w:val="666666"/>
           <w:sz w:val="20"/>
         </w:rPr>
-        <w:t>10 s  ·  ao final: 06:05</w:t>
+        <w:t>10 s  ·  ao final: 07:25</w:t>
       </w:r>
     </w:p>
     <w:p>
@@ -811,7 +896,7 @@
         <w:pStyle w:val="Heading2"/>
       </w:pPr>
       <w:r>
-        <w:t>Lâmina 9 · Percurso e respostas da revisão</w:t>
+        <w:t>Lâmina 10 · Percurso e respostas da revisão</w:t>
       </w:r>
     </w:p>
     <w:p>
@@ -820,7 +905,7 @@
           <w:color w:val="666666"/>
           <w:sz w:val="20"/>
         </w:rPr>
-        <w:t>65 s  ·  ao final: 07:10</w:t>
+        <w:t>60 s  ·  ao final: 08:25</w:t>
       </w:r>
     </w:p>
     <w:p>
@@ -828,7 +913,7 @@
         <w:jc w:val="both"/>
       </w:pPr>
       <w:r>
-        <w:t>A revisão partiu de uma pergunta: o que a produção científica evidencia sobre a implementação de políticas públicas de educação digital nos anos iniciais do Ensino Fundamental? Seguimos a declaração PRISMA 2020, estruturamos a questão pelo modelo PICo e fizemos a síntese temática proposta por Thomas e Harden. As sete bases retornaram 176 registros; avaliamos 35 textos completos e chegamos a nove estudos, publicados entre 2021 e 2024. Quanto às respostas, os condicionantes incluem, além de equipamentos e conectividade, formação continuada, estabilidade das equipes, tempo de trabalho e o próprio marco regulatório. O papel dos profissionais recebeu a resposta mais convergente: a política é feita de interpretação e de decisões situadas. Os sentidos de cultura digital e de formação cidadã, por sua vez, têm apoio frágil no corpus.</w:t>
+        <w:t>A revisão partiu de uma pergunta: o que a produção científica evidencia sobre a implementação de políticas públicas de educação digital nos anos iniciais do Ensino Fundamental? Seguimos a declaração PRISMA 2020, estruturamos a questão pelo modelo PICo e fizemos a síntese temática proposta por Thomas e Harden. As sete bases retornaram 176 registros; avaliamos 35 textos completos e chegamos a nove estudos, publicados entre 2021 e 2024. Os condicionantes incluem, além de equipamentos e conectividade, formação continuada, estabilidade das equipes, tempo de trabalho e o próprio marco regulatório. O papel dos profissionais recebeu a resposta mais convergente: a política é feita de interpretação e de decisões situadas. Os sentidos de cultura digital e de formação cidadã têm apoio frágil.</w:t>
       </w:r>
     </w:p>
     <w:p>
@@ -836,7 +921,7 @@
         <w:pStyle w:val="Heading2"/>
       </w:pPr>
       <w:r>
-        <w:t>Lâmina 10 · Lacunas</w:t>
+        <w:t>Lâmina 11 · O que a revisão decidiu</w:t>
       </w:r>
     </w:p>
     <w:p>
@@ -845,7 +930,7 @@
           <w:color w:val="666666"/>
           <w:sz w:val="20"/>
         </w:rPr>
-        <w:t>60 s  ·  ao final: 08:10</w:t>
+        <w:t>85 s  ·  ao final: 09:50</w:t>
       </w:r>
     </w:p>
     <w:p>
@@ -854,7 +939,7 @@
           <w:i/>
           <w:color w:val="555555"/>
         </w:rPr>
-        <w:t>[Ler a coluna da esquerda e, em seguida, mostrar a correspondência na coluna da direita.]</w:t>
+        <w:t>[Ler cada linha da esquerda para a direita, seguindo a seta.]</w:t>
       </w:r>
     </w:p>
     <w:p>
@@ -862,7 +947,7 @@
         <w:jc w:val="both"/>
       </w:pPr>
       <w:r>
-        <w:t>Dessas respostas e do registro das exclusões saem as lacunas. Nenhum estudo examina a PNED nos anos iniciais, o que tem explicação cronológica, já que a exigência curricular começa agora. Os anos iniciais aparecem tratados em bloco, e o ciclo de alfabetização quase não aparece. Predomina o contexto emergencial da pandemia. Faltam estudos sobre redes municipais de pequeno porte, as crianças não aparecem como sujeitos e as plataformas e os dados escolares ficam sem problematização. A tese responde a esse quadro: toma o eixo Educação Digital Escolar como objeto, delimita o 1º ao 5º ano com o ciclo de alfabetização, estuda o funcionamento ordinário de uma escola numa rede pequena, ouve os profissionais sem pretender avaliar efeitos sobre as crianças e trata plataformas e dados como contexto teórico.</w:t>
+        <w:t>A revisão orientou decisões da tese, e esta lâmina mostra cada uma delas. Os estudos tratam os anos iniciais em bloco e quase não delimitam o ciclo de alfabetização; por isso, a tese delimita o 1º ao 5º ano, com esse ciclo incluído. Nenhum estudo examina a PNED nem uma rede municipal de pequeno porte; a tese toma o eixo Educação Digital Escolar como objeto, na rede de Tibau do Sul. Predominam respostas emergenciais à pandemia; a tese estuda a política no funcionamento ordinário da escola. O corpus mostra que as condições vão além do equipamento e que os profissionais interpretam a política, e daí nasce a pergunta sobre o que eles fazem quando a condição anunciada não chega. Cultura digital e formação cidadã têm apoio frágil, e as crianças não aparecem como sujeitos; o tema será tratado de modo exploratório, ouvindo os profissionais, sem avaliar efeitos sobre as crianças. Por fim, os três eixos da revisão serviram de referência para o questionário e as entrevistas, sem virar categorias fechadas.</w:t>
       </w:r>
     </w:p>
     <w:p>
@@ -878,7 +963,7 @@
         <w:pStyle w:val="Heading2"/>
       </w:pPr>
       <w:r>
-        <w:t>Lâmina 11 · Divisor: Fundamentos teóricos</w:t>
+        <w:t>Lâmina 12 · Divisor: Fundamentos teóricos</w:t>
       </w:r>
     </w:p>
     <w:p>
@@ -887,7 +972,7 @@
           <w:color w:val="666666"/>
           <w:sz w:val="20"/>
         </w:rPr>
-        <w:t>10 s  ·  ao final: 08:20</w:t>
+        <w:t>10 s  ·  ao final: 10:00</w:t>
       </w:r>
     </w:p>
     <w:p>
@@ -895,7 +980,7 @@
         <w:jc w:val="both"/>
       </w:pPr>
       <w:r>
-        <w:t>Com as lacunas delimitadas, apresento os fundamentos teóricos, reunidos no terceiro capítulo.</w:t>
+        <w:t>Com essas escolhas feitas, passo aos fundamentos teóricos, que acompanham a política do texto ao ato.</w:t>
       </w:r>
     </w:p>
     <w:p>
@@ -903,7 +988,7 @@
         <w:pStyle w:val="Heading2"/>
       </w:pPr>
       <w:r>
-        <w:t>Lâmina 12 · Ciclo de políticas</w:t>
+        <w:t>Lâmina 13 · Do texto ao ato</w:t>
       </w:r>
     </w:p>
     <w:p>
@@ -912,7 +997,16 @@
           <w:color w:val="666666"/>
           <w:sz w:val="20"/>
         </w:rPr>
-        <w:t>45 s  ·  ao final: 09:05</w:t>
+        <w:t>85 s  ·  ao final: 11:25</w:t>
+      </w:r>
+    </w:p>
+    <w:p>
+      <w:r>
+        <w:rPr>
+          <w:i/>
+          <w:color w:val="555555"/>
+        </w:rPr>
+        <w:t>[Seguir as setas: influência, produção do texto, prática.]</w:t>
       </w:r>
     </w:p>
     <w:p>
@@ -920,7 +1014,7 @@
         <w:jc w:val="both"/>
       </w:pPr>
       <w:r>
-        <w:t>A matriz é a Abordagem do Ciclo de Políticas, de Bowe, Ball e Gold, sistematizada no Brasil por Mainardes. A política é um processo contínuo, em que formulação e prática se influenciam. Os contextos de influência e de produção do texto são examinados no capítulo 5, com as agendas internacionais e a Lei nº 14.533. O contexto da prática ocupa posição privilegiada e é tratado nos capítulos 6 e 7, com a escola e seus profissionais. A premissa está na citação da lâmina: os profissionais não se deparam com os textos das políticas como leitores ingênuos.</w:t>
+        <w:t>O capítulo 3 organiza a teoria pelo caminho da política. A Abordagem do Ciclo de Políticas, de Bowe, Ball e Gold, sistematizada no Brasil por Mainardes, entende a política como processo contínuo, em que formulação e prática se influenciam. No contexto de influência, agendas e discursos disputam as finalidades da educação digital. No contexto da produção do texto, essas disputas ganham forma na Lei nº 14.533 e na Resolução CNE/CEB nº 2, e ali se lê o que a lei pede e com que meios. Esses dois contextos são examinados no capítulo 5. No contexto da prática, a política é posta em ato, e é aqui que entra a teoria da atuação de Ball, Maguire e Braun, com quatro dimensões: a situada, que traz Pipa e a história da escola; a das culturas profissionais; a material, com prédio, equipamentos e conexão; e a externa, com as orientações da rede. Esse contexto é tratado nos capítulos 6 e 7. Como lembram Bowe, Ball e Gold, os profissionais não leem os textos da política como leitores ingênuos.</w:t>
       </w:r>
     </w:p>
     <w:p>
@@ -928,7 +1022,7 @@
         <w:pStyle w:val="Heading2"/>
       </w:pPr>
       <w:r>
-        <w:t>Lâmina 13 · Teoria da atuação</w:t>
+        <w:t>Lâmina 14 · No contexto da prática</w:t>
       </w:r>
     </w:p>
     <w:p>
@@ -937,7 +1031,7 @@
           <w:color w:val="666666"/>
           <w:sz w:val="20"/>
         </w:rPr>
-        <w:t>60 s  ·  ao final: 10:05</w:t>
+        <w:t>85 s  ·  ao final: 12:50</w:t>
       </w:r>
     </w:p>
     <w:p>
@@ -945,7 +1039,7 @@
         <w:jc w:val="both"/>
       </w:pPr>
       <w:r>
-        <w:t>A teoria da atuação de Ball, Maguire e Braun é o principal dispositivo analítico. Uso também a palavra encenação, com que os estudos brasileiros têm traduzido enactment. Para os autores, a política é codificada em textos e artefatos e é decodificada, e recodificada, de forma igualmente complexa. Eles propõem quatro dimensões do contexto. A situada reúne a história da escola, sua localização e seu público, e é por ela que Pipa entra no estudo. A das culturas profissionais trata de valores, compromissos e relações. A material inclui prédio, equipamentos e conectividade. A externa abrange as orientações da rede e de outras instâncias, e é por ela que se justifica ouvir um técnico da Secretaria Municipal de Educação. O contexto, dizem os autores, é uma força ativa.</w:t>
+        <w:t>Dentro do contexto da prática, três noções ajudam a entender o que acontece com a política. As culturas profissionais filtram a leitura. Com Hargreaves, são crenças, valores, hábitos e formas de fazer das comunidades de professores, que podem tomar a forma do individualismo, da colaboração, da colegialidade artificial ou da balcanização. O que uma equipe considera um bom trabalho pesa sobre o que será priorizado. A performatividade pressiona. Ball a descreve como prestação de contas feita de julgamentos, comparações e exposições, e chama de fabricação a escola produzida para ser vista. Se a PNED traz essas exigências à escola é questão para os dados. As relações de poder tensionam. Com Foucault, o poder não é unívoco e tem focos de instabilidade; por isso as formas de atuação vão da adesão à resistência, sem que nenhuma seja pressuposta. Ball adverte contra culpar a escola e contra heroicizar os sujeitos, e Freire lembra que, sem condições favoráveis, o professor se move menos eficazmente no espaço pedagógico.</w:t>
       </w:r>
     </w:p>
     <w:p>
@@ -953,7 +1047,7 @@
         <w:pStyle w:val="Heading2"/>
       </w:pPr>
       <w:r>
-        <w:t>Lâmina 14 · Culturas profissionais e performatividade</w:t>
+        <w:t>Lâmina 15 · Onde a política é posta em ato</w:t>
       </w:r>
     </w:p>
     <w:p>
@@ -962,57 +1056,7 @@
           <w:color w:val="666666"/>
           <w:sz w:val="20"/>
         </w:rPr>
-        <w:t>50 s  ·  ao final: 10:55</w:t>
-      </w:r>
-    </w:p>
-    <w:p>
-      <w:pPr>
-        <w:jc w:val="both"/>
-      </w:pPr>
-      <w:r>
-        <w:t>Duas noções ajudam a entender o que filtra e o que pressiona essa atuação. Com Hargreaves, as culturas do ensino compreendem crenças, valores, hábitos e formas de fazer as coisas assumidas pelas comunidades de professores. O autor distingue o conteúdo dessas culturas de sua forma, que pode ser o individualismo, a colaboração, a colegialidade artificial ou a balcanização. Com Ball, a performatividade é um regime de prestação de contas que emprega julgamentos, comparações e exposições como meios de controle. A fabricação nomeia as versões da escola produzidas para serem vistas e avaliadas. Se a PNED traz essas exigências à escola de Pipa é questão para os dados.</w:t>
-      </w:r>
-    </w:p>
-    <w:p>
-      <w:pPr>
-        <w:pStyle w:val="Heading2"/>
-      </w:pPr>
-      <w:r>
-        <w:t>Lâmina 15 · Poder e resistência</w:t>
-      </w:r>
-    </w:p>
-    <w:p>
-      <w:r>
-        <w:rPr>
-          <w:color w:val="666666"/>
-          <w:sz w:val="20"/>
-        </w:rPr>
-        <w:t>65 s  ·  ao final: 12:00</w:t>
-      </w:r>
-    </w:p>
-    <w:p>
-      <w:pPr>
-        <w:jc w:val="both"/>
-      </w:pPr>
-      <w:r>
-        <w:t>A palavra resistências está no título por escolha deliberada, e isso pede cuidado. Foucault dá a essa abertura um estatuto teórico: as relações de poder não são unívocas e definem inúmeros pontos de luta e focos de instabilidade. Onde há normas, exigências e registros, há também pontos em que eles se tornam instáveis. Por isso a resistência aparece na lâmina ao lado de outras formas possíveis de atuação, como adesão, acomodação, adaptação, omissão seletiva, negociação e ressignificação. Uma prática distante da norma pode decorrer da falta de condições, da prioridade dada a outra demanda ou de outra leitura do texto. Ball adverte contra as pesquisas que culpam a escola e o professor e contra as que transformam os sujeitos em heróis althusserianos. Freire lembra que, sem condições favoráveis, o professor se move menos eficazmente no espaço pedagógico. A análise vai descrever o que os profissionais fazem e as condições em que fazem.</w:t>
-      </w:r>
-    </w:p>
-    <w:p>
-      <w:pPr>
-        <w:pStyle w:val="Heading2"/>
-      </w:pPr>
-      <w:r>
-        <w:t>Lâmina 16 · Habitar o digital</w:t>
-      </w:r>
-    </w:p>
-    <w:p>
-      <w:r>
-        <w:rPr>
-          <w:color w:val="666666"/>
-          <w:sz w:val="20"/>
-        </w:rPr>
-        <w:t>70 s  ·  ao final: 13:10</w:t>
+        <w:t>85 s  ·  ao final: 14:15</w:t>
       </w:r>
     </w:p>
     <w:p>
@@ -1029,57 +1073,7 @@
         <w:jc w:val="both"/>
       </w:pPr>
       <w:r>
-        <w:t>Chego à formulação própria da tese, habitar o digital. Ela parte da tradição do habitar. Schlemmer, Backes e Palagi lembram que habitar tem o significado de estar presente e tem natureza relacional. Di Felice mostra como as tecnologias comunicativas transformam a relação entre sujeito, meios e território, e afirma que a escrita artificial inaugurou um novo modo de habitar. A esses autores somo Santos e Massey. Na tese, habitar o digital designa as maneiras pelas quais as tecnologias digitais atravessam os espaços, as relações e as práticas cotidianas de um território, produzindo possibilidades desiguais de acesso, participação e apropriação. Em Pipa, a expressão nomeia uma tensão: alta densidade tecnológica nos circuitos turísticos do distrito e pouca tecnologia nos espaços pedagógicos da escola. A formulação será confrontada com os dados e poderá ser revista.</w:t>
-      </w:r>
-    </w:p>
-    <w:p>
-      <w:pPr>
-        <w:pStyle w:val="Heading2"/>
-      </w:pPr>
-      <w:r>
-        <w:t>Lâmina 17 · Plataformas, dados e solucionismo</w:t>
-      </w:r>
-    </w:p>
-    <w:p>
-      <w:r>
-        <w:rPr>
-          <w:color w:val="666666"/>
-          <w:sz w:val="20"/>
-        </w:rPr>
-        <w:t>40 s  ·  ao final: 13:50</w:t>
-      </w:r>
-    </w:p>
-    <w:p>
-      <w:pPr>
-        <w:jc w:val="both"/>
-      </w:pPr>
-      <w:r>
-        <w:t>Uma subseção do capítulo 3 trata de plataformas, dados e solucionismo como contexto teórico. Zuboff descreve o capitalismo de vigilância, que toma a experiência humana como matéria-prima gratuita. Silveira mostra que o mercado de dados pessoais cresce contra a ideia de privacidade, e Morozov critica o solucionismo, que pretende resolver problemas sociais por aplicativos. Pretto, Cordeiro e Oliveira trazem o contraponto da participação: na cultura digital, os sujeitos podem ser produtores ativos de cultura. Essas questões entram no campo pelo Eixo 6 da entrevista.</w:t>
-      </w:r>
-    </w:p>
-    <w:p>
-      <w:pPr>
-        <w:pStyle w:val="Heading2"/>
-      </w:pPr>
-      <w:r>
-        <w:t>Lâmina 18 · Dos conceitos às lentes de análise</w:t>
-      </w:r>
-    </w:p>
-    <w:p>
-      <w:r>
-        <w:rPr>
-          <w:color w:val="666666"/>
-          <w:sz w:val="20"/>
-        </w:rPr>
-        <w:t>35 s  ·  ao final: 14:25</w:t>
-      </w:r>
-    </w:p>
-    <w:p>
-      <w:pPr>
-        <w:jc w:val="both"/>
-      </w:pPr>
-      <w:r>
-        <w:t>Reunidos, esses referenciais funcionam como lentes, e cada um faz aos dados uma pergunta. A ACP pergunta como a PNED foi lida e recriada. A atuação pergunta que condições pesam nas escolhas. As culturas profissionais perguntam o que a equipe valoriza ou deixa de lado. A performatividade pergunta pelos registros, a leitura do poder pergunta onde uma orientação é recusada ou ressignificada, e habitar o digital pergunta que participação é possível.</w:t>
+        <w:t>Falta dizer onde a política é posta em ato. Com Milton Santos, a categoria de análise é o território usado, e as rugosidades são o que fica do passado como forma e paisagem. Com Doreen Massey, o lugar é um encontro de trajetórias. Pipa é esse lugar, e as crianças da escola vêm de famílias de moradores antigos, de migrantes, de estrangeiros e de pessoas ligadas ao turismo. Desse diálogo, somado à tradição do habitar em Schlemmer, Backes e Palagi e em Di Felice, nasce a formulação própria da tese: habitar o digital designa as maneiras pelas quais as tecnologias digitais atravessam os espaços, as relações e as práticas cotidianas de um território, produzindo possibilidades desiguais de acesso, participação e apropriação. As plataformas e os dados, discutidos com Zuboff, Silveira, Morozov e Pretto, entram como contexto da proteção e da participação das crianças e chegam ao campo pelo eixo 6 da entrevista. A formulação será confrontada com os dados e poderá ser revista.</w:t>
       </w:r>
     </w:p>
     <w:p>
@@ -1095,7 +1089,7 @@
         <w:pStyle w:val="Heading2"/>
       </w:pPr>
       <w:r>
-        <w:t>Lâmina 19 · Divisor: Metodologia</w:t>
+        <w:t>Lâmina 16 · Divisor: Metodologia</w:t>
       </w:r>
     </w:p>
     <w:p>
@@ -1104,7 +1098,7 @@
           <w:color w:val="666666"/>
           <w:sz w:val="20"/>
         </w:rPr>
-        <w:t>10 s  ·  ao final: 14:35</w:t>
+        <w:t>10 s  ·  ao final: 14:25</w:t>
       </w:r>
     </w:p>
     <w:p>
@@ -1112,7 +1106,7 @@
         <w:jc w:val="both"/>
       </w:pPr>
       <w:r>
-        <w:t>Vejamos como essas lentes se convertem em procedimentos, no capítulo 4.</w:t>
+        <w:t>Vejamos como esse quadro se converte em procedimentos, no capítulo 4.</w:t>
       </w:r>
     </w:p>
     <w:p>
@@ -1120,7 +1114,7 @@
         <w:pStyle w:val="Heading2"/>
       </w:pPr>
       <w:r>
-        <w:t>Lâmina 20 · Desenho da pesquisa</w:t>
+        <w:t>Lâmina 17 · Desenho e participantes</w:t>
       </w:r>
     </w:p>
     <w:p>
@@ -1129,7 +1123,7 @@
           <w:color w:val="666666"/>
           <w:sz w:val="20"/>
         </w:rPr>
-        <w:t>45 s  ·  ao final: 15:20</w:t>
+        <w:t>60 s  ·  ao final: 15:25</w:t>
       </w:r>
     </w:p>
     <w:p>
@@ -1137,7 +1131,7 @@
         <w:jc w:val="both"/>
       </w:pPr>
       <w:r>
-        <w:t>A pesquisa é qualitativa e interpretativa, como a define Minayo, e se organiza como estudo de caso, nos termos de Yin, por tratar de um fenômeno contemporâneo em seu contexto real. A Secretaria Municipal de Educação entra como dimensão complementar do contexto externo, sem formar um segundo caso. Não faremos observação de sala de aula, delimitação que Ball, Maguire e Braun também adotaram. Como trabalho na rede, adotamos cuidados próprios: confronto entre fontes, devolutiva individual e diário de campo. A análise será temática reflexiva, com Braun e Clarke.</w:t>
+        <w:t>A pesquisa é qualitativa e interpretativa, como a define Minayo, e se organiza como estudo de caso, nos termos de Yin. A Secretaria Municipal de Educação entra como dimensão complementar do contexto externo. Não faremos observação de sala de aula, delimitação que Ball, Maguire e Braun também adotaram, e a análise será temática reflexiva, com Braun e Clarke. Podem participar 24 profissionais da escola: o diretor, a vice-diretora, a coordenadora pedagógica, quatro profissionais do apoio pedagógico, quinze regentes e dois que atuam no apoio à recomposição de aula, além de um técnico da Secretaria. A escola tem 351 crianças em quinze turmas, e elas não participam da produção de dados.</w:t>
       </w:r>
     </w:p>
     <w:p>
@@ -1145,7 +1139,7 @@
         <w:pStyle w:val="Heading2"/>
       </w:pPr>
       <w:r>
-        <w:t>Lâmina 21 · Participantes</w:t>
+        <w:t>Lâmina 18 · Construção dos dados</w:t>
       </w:r>
     </w:p>
     <w:p>
@@ -1154,7 +1148,7 @@
           <w:color w:val="666666"/>
           <w:sz w:val="20"/>
         </w:rPr>
-        <w:t>40 s  ·  ao final: 16:00</w:t>
+        <w:t>60 s  ·  ao final: 16:25</w:t>
       </w:r>
     </w:p>
     <w:p>
@@ -1162,57 +1156,7 @@
         <w:jc w:val="both"/>
       </w:pPr>
       <w:r>
-        <w:t>Podem participar 24 profissionais da escola: o diretor, a vice-diretora, a coordenadora pedagógica, quatro profissionais do apoio pedagógico, quinze professoras e professores regentes e dois que atuam no apoio à recomposição de aula. Soma-se um técnico da Secretaria, o coordenador de políticas públicas e programas educacionais. A escola tem, em 2026, quinze turmas nos anos iniciais e 351 crianças matriculadas. As crianças não participam da produção de dados.</w:t>
-      </w:r>
-    </w:p>
-    <w:p>
-      <w:pPr>
-        <w:pStyle w:val="Heading2"/>
-      </w:pPr>
-      <w:r>
-        <w:t>Lâmina 22 · Cinco movimentos</w:t>
-      </w:r>
-    </w:p>
-    <w:p>
-      <w:r>
-        <w:rPr>
-          <w:color w:val="666666"/>
-          <w:sz w:val="20"/>
-        </w:rPr>
-        <w:t>45 s  ·  ao final: 16:45</w:t>
-      </w:r>
-    </w:p>
-    <w:p>
-      <w:pPr>
-        <w:jc w:val="both"/>
-      </w:pPr>
-      <w:r>
-        <w:t>Os dados serão construídos em cinco movimentos. O primeiro é a análise documental: a lei, a resolução de 2025, o Projeto Político-Pedagógico, os planos de aula, as atas e os registros da Secretaria. O segundo é o registro iconográfico, com 38 imagens da escola e do Museu Digital de Pipa. O terceiro é um questionário de perfil e de primeiras percepções. O quarto são entrevistas semiestruturadas, de 60 a 90 minutos. O quinto reúne as fontes na análise, com triangulação, e devolve os resultados à escola e à Secretaria.</w:t>
-      </w:r>
-    </w:p>
-    <w:p>
-      <w:pPr>
-        <w:pStyle w:val="Heading2"/>
-      </w:pPr>
-      <w:r>
-        <w:t>Lâmina 23 · Ética e campo</w:t>
-      </w:r>
-    </w:p>
-    <w:p>
-      <w:r>
-        <w:rPr>
-          <w:color w:val="666666"/>
-          <w:sz w:val="20"/>
-        </w:rPr>
-        <w:t>40 s  ·  ao final: 17:25</w:t>
-      </w:r>
-    </w:p>
-    <w:p>
-      <w:pPr>
-        <w:jc w:val="both"/>
-      </w:pPr>
-      <w:r>
-        <w:t>A pesquisa será submetida ao Comitê de Ética como emenda ao protocolo já aprovado, e o campo só começa depois da aprovação. Haverá Termo de Consentimento, pseudônimos escolhidos pelos próprios participantes e observância das Resoluções 466 de 2012 e 510 de 2016. O campo restante ocupa dez semanas: duas de entrada, duas de questionários, quatro de entrevistas e documentos e duas de devolutivas parciais.</w:t>
+        <w:t>Os dados serão construídos em cinco movimentos. O primeiro é a análise documental, da lei e da resolução de 2025 ao Projeto Político-Pedagógico, aos planos, às atas e aos registros da Secretaria. O segundo é o registro iconográfico, com 38 imagens da escola e do Museu Digital de Pipa, já realizado. O terceiro é o questionário de perfil e primeiras percepções; o quarto, as entrevistas semiestruturadas, de 60 a 90 minutos; o quinto reúne as fontes na análise e devolve os resultados à escola e à Secretaria. A pesquisa vai ao Comitê de Ética como emenda ao protocolo já aprovado, com Termo de Consentimento, pseudônimos e as Resoluções 466 e 510, e o campo ocupa dez semanas depois da aprovação.</w:t>
       </w:r>
     </w:p>
     <w:p>
@@ -1228,7 +1172,7 @@
         <w:pStyle w:val="Heading2"/>
       </w:pPr>
       <w:r>
-        <w:t>Lâmina 24 · Divisor: Agenda global e PNED</w:t>
+        <w:t>Lâmina 19 · Divisor: Agenda global e PNED</w:t>
       </w:r>
     </w:p>
     <w:p>
@@ -1237,7 +1181,7 @@
           <w:color w:val="666666"/>
           <w:sz w:val="20"/>
         </w:rPr>
-        <w:t>10 s  ·  ao final: 17:35</w:t>
+        <w:t>10 s  ·  ao final: 16:35</w:t>
       </w:r>
     </w:p>
     <w:p>
@@ -1245,7 +1189,7 @@
         <w:jc w:val="both"/>
       </w:pPr>
       <w:r>
-        <w:t>O capítulo 5 lê o contexto de produção do texto da política.</w:t>
+        <w:t>O capítulo 5 lê os contextos de influência e de produção do texto.</w:t>
       </w:r>
     </w:p>
     <w:p>
@@ -1253,7 +1197,7 @@
         <w:pStyle w:val="Heading2"/>
       </w:pPr>
       <w:r>
-        <w:t>Lâmina 25 · Agendas internacionais</w:t>
+        <w:t>Lâmina 20 · O que outros territórios nos ensinam</w:t>
       </w:r>
     </w:p>
     <w:p>
@@ -1262,7 +1206,16 @@
           <w:color w:val="666666"/>
           <w:sz w:val="20"/>
         </w:rPr>
-        <w:t>40 s  ·  ao final: 18:15</w:t>
+        <w:t>85 s  ·  ao final: 18:00</w:t>
+      </w:r>
+    </w:p>
+    <w:p>
+      <w:r>
+        <w:rPr>
+          <w:i/>
+          <w:color w:val="555555"/>
+        </w:rPr>
+        <w:t>[Apontar no mapa cada país citado; não ler a lista inteira.]</w:t>
       </w:r>
     </w:p>
     <w:p>
@@ -1270,7 +1223,7 @@
         <w:jc w:val="both"/>
       </w:pPr>
       <w:r>
-        <w:t>Partimos de três organismos. A UNESCO, em 2023, insiste nas condições de incorporação das tecnologias e na interação com os professores. A OCDE, em 2015, duvida de que o investimento em tecnologia se traduza diretamente em aprendizagem. O Banco Mundial, em 2020, começa pela finalidade educacional. Com suas diferenças, os três deslocam o foco da presença dos recursos para as condições, os usos e as finalidades. A comparação entre experiências europeias e americanas gerou cinco categorias sensibilizadoras: governança, formação, infraestrutura, continuidade institucional e cultura digital.</w:t>
+        <w:t>O capítulo começa pelas agendas da UNESCO, da OCDE e do Banco Mundial, que, com suas diferenças, deslocam o foco da presença dos recursos para as condições, os usos e as finalidades. Em seguida, compara experiências de outros territórios. O mapa reúne nove casos nas Américas, dez na Europa e o Brasil em destaque, e a cor indica a categoria principal que cada experiência informa. Na lista ao lado está o foco de cada política. Nos Estados Unidos, os fossos de acesso, desenho e uso; no Uruguai, o Plan Ceibal, com acesso universal e continuidade entre governos; na Argentina, três reversões normativas em quinze anos; no Peru, ampliação do acesso sem ganhos equivalentes de aprendizagem. Na Europa, a União Europeia oferece referenciais comuns e uma estratégia de proteção infantil; a Alemanha mostra que recursos não substituem a coordenação entre escalas; na Itália, o acesso igual conviveu com usos desiguais; e a Finlândia delega ao município a decisão sobre o uso das tecnologias, cadeia parecida com a que acompanhamos em Tibau do Sul.</w:t>
       </w:r>
     </w:p>
     <w:p>
@@ -1278,7 +1231,7 @@
         <w:pStyle w:val="Heading2"/>
       </w:pPr>
       <w:r>
-        <w:t>Lâmina 26 · A PNED e o vazio material</w:t>
+        <w:t>Lâmina 21 · O que a comparação traz para a tese</w:t>
       </w:r>
     </w:p>
     <w:p>
@@ -1287,7 +1240,41 @@
           <w:color w:val="666666"/>
           <w:sz w:val="20"/>
         </w:rPr>
-        <w:t>65 s  ·  ao final: 19:20</w:t>
+        <w:t>75 s  ·  ao final: 19:15</w:t>
+      </w:r>
+    </w:p>
+    <w:p>
+      <w:r>
+        <w:rPr>
+          <w:i/>
+          <w:color w:val="555555"/>
+        </w:rPr>
+        <w:t>[As cores dos cartões são as mesmas do mapa.]</w:t>
+      </w:r>
+    </w:p>
+    <w:p>
+      <w:pPr>
+        <w:jc w:val="both"/>
+      </w:pPr>
+      <w:r>
+        <w:t>O que essa comparação traz para a tese? Das recorrências e das diferenças saem cinco categorias sensibilizadoras, que vão orientar a leitura do campo. A governança, porque coordenar escalas faz parte da política, e perguntaremos o que chega da União e do estado à rede e o que a Secretaria repassa à escola. A formação, porque a mediação dos profissionais é condição do uso, e perguntaremos que formação chegou e quando. A infraestrutura, condição relevante e insuficiente, que leva à pergunta sobre os equipamentos com que se trabalha. A continuidade institucional, que leva à história da rede municipal. E a cultura digital, ligada à cidadania e à proteção, que pergunta o que se faz com crianças de seis a dez anos. Nenhuma experiência descreve Pipa, e fica a pergunta que nenhum caso responde: o que acontece quando a PNED chega a uma escola onde parte dessas condições não está garantida?</w:t>
+      </w:r>
+    </w:p>
+    <w:p>
+      <w:pPr>
+        <w:pStyle w:val="Heading2"/>
+      </w:pPr>
+      <w:r>
+        <w:t>Lâmina 22 · A PNED e o vazio material</w:t>
+      </w:r>
+    </w:p>
+    <w:p>
+      <w:r>
+        <w:rPr>
+          <w:color w:val="666666"/>
+          <w:sz w:val="20"/>
+        </w:rPr>
+        <w:t>70 s  ·  ao final: 20:25</w:t>
       </w:r>
     </w:p>
     <w:p>
@@ -1320,7 +1307,7 @@
         <w:pStyle w:val="Heading2"/>
       </w:pPr>
       <w:r>
-        <w:t>Lâmina 27 · Divisor: Território e escola</w:t>
+        <w:t>Lâmina 23 · Divisor: Território e escola</w:t>
       </w:r>
     </w:p>
     <w:p>
@@ -1329,7 +1316,7 @@
           <w:color w:val="666666"/>
           <w:sz w:val="20"/>
         </w:rPr>
-        <w:t>10 s  ·  ao final: 19:30</w:t>
+        <w:t>10 s  ·  ao final: 20:35</w:t>
       </w:r>
     </w:p>
     <w:p>
@@ -1345,7 +1332,7 @@
         <w:pStyle w:val="Heading2"/>
       </w:pPr>
       <w:r>
-        <w:t>Lâmina 28 · De aldeia de pescadores a polo turístico</w:t>
+        <w:t>Lâmina 24 · Pipa</w:t>
       </w:r>
     </w:p>
     <w:p>
@@ -1354,7 +1341,7 @@
           <w:color w:val="666666"/>
           <w:sz w:val="20"/>
         </w:rPr>
-        <w:t>55 s  ·  ao final: 20:25</w:t>
+        <w:t>65 s  ·  ao final: 21:40</w:t>
       </w:r>
     </w:p>
     <w:p>
@@ -1363,7 +1350,7 @@
           <w:i/>
           <w:color w:val="555555"/>
         </w:rPr>
-        <w:t>[Apontar a foto do barco e depois a dos surfistas.]</w:t>
+        <w:t>[Apontar as fotos da esquerda para a direita.]</w:t>
       </w:r>
     </w:p>
     <w:p>
@@ -1371,7 +1358,7 @@
         <w:jc w:val="both"/>
       </w:pPr>
       <w:r>
-        <w:t>Nos anos 1970, Pipa era uma comunidade agrícola e pesqueira, sem energia elétrica, água encanada e boas vias de acesso. A partir de meados daquela década chegaram os surfistas, e a divulgação mais intensa nos anos 1990 trouxe turistas de várias partes do mundo, como reconstitui Aires. As fotografias, do Museu Digital de Pipa, mostram a construção artesanal de uma embarcação e um grupo de surfistas em abril de 1991. Nesse processo, casas e terrenos de nativos foram vendidos, trocados ou alugados. Aires observa que a população nativa não foi passiva e que muitas paisagens ainda revelam materialidades de tempos passados, observação que aproxima a história do distrito da noção de rugosidade.</w:t>
+        <w:t>Nos anos 1970, Pipa era uma comunidade agrícola e pesqueira, sem energia elétrica, água encanada e boas vias de acesso. A partir de meados daquela década chegaram os surfistas, e a divulgação mais intensa nos anos 1990 trouxe turistas de várias partes do mundo, como reconstitui Aires. As fotografias mostram essa passagem: a construção artesanal de uma embarcação, um grupo de surfistas em abril de 1991 e a vista aérea atual, com pousadas e restaurantes que se vendem pela internet. Aires observa que a população nativa não foi passiva e que muitas paisagens ainda revelam materialidades de tempos passados, o que aproxima a história do distrito da noção de rugosidade. Massey nos impede de ler a distância entre escola e polo turístico como atraso: os dois são contemporâneos.</w:t>
       </w:r>
     </w:p>
     <w:p>
@@ -1379,7 +1366,7 @@
         <w:pStyle w:val="Heading2"/>
       </w:pPr>
       <w:r>
-        <w:t>Lâmina 29 · O distrito e a escola</w:t>
+        <w:t>Lâmina 25 · A escola</w:t>
       </w:r>
     </w:p>
     <w:p>
@@ -1388,7 +1375,7 @@
           <w:color w:val="666666"/>
           <w:sz w:val="20"/>
         </w:rPr>
-        <w:t>40 s  ·  ao final: 21:05</w:t>
+        <w:t>70 s  ·  ao final: 22:50</w:t>
       </w:r>
     </w:p>
     <w:p>
@@ -1396,66 +1383,7 @@
         <w:jc w:val="both"/>
       </w:pPr>
       <w:r>
-        <w:t>O distrito de hoje é o da vista aérea: pousadas, restaurantes e passeios vendidos pela internet. A escola está no mesmo lugar, com salas sem telas e um laboratório que encontramos desligado. Santos ajuda a nomear essa diferença ao distinguir zonas servidas pelos meios de conhecimento e áreas desprovidas dessa vantagem. Massey impede que a distância seja lida como atraso: escola e polo turístico são contemporâneos e não ocupam lugares numa fila da história.</w:t>
-      </w:r>
-    </w:p>
-    <w:p>
-      <w:pPr>
-        <w:pStyle w:val="Heading2"/>
-      </w:pPr>
-      <w:r>
-        <w:t>Lâmina 30 · A escola e o laboratório</w:t>
-      </w:r>
-    </w:p>
-    <w:p>
-      <w:r>
-        <w:rPr>
-          <w:color w:val="666666"/>
-          <w:sz w:val="20"/>
-        </w:rPr>
-        <w:t>55 s  ·  ao final: 22:00</w:t>
-      </w:r>
-    </w:p>
-    <w:p>
-      <w:r>
-        <w:rPr>
-          <w:i/>
-          <w:color w:val="555555"/>
-        </w:rPr>
-        <w:t>[Apontar a fachada e, em seguida, o laboratório.]</w:t>
-      </w:r>
-    </w:p>
-    <w:p>
-      <w:pPr>
-        <w:jc w:val="both"/>
-      </w:pPr>
-      <w:r>
-        <w:t>Esta é a fachada da escola, e este é o laboratório de informática, fotografado com os equipamentos desligados. A imagem não diz há quanto tempo o espaço está assim nem por quê; essas perguntas ficam para as demais fontes. Segundo informação preliminar, ainda a confirmar no documento de aquisição, os computadores foram comprados pela Prefeitura em 2022, pouco antes da lei. A política nacional encontra equipamentos de uma iniciativa municipal anterior e lhes atribui nova função. Chamamos essa situação de rugosidade tecnológica, com Santos, para quem a forma permanece aguardando o próximo movimento dinâmico da sociedade, quando pode ser chamada a cumprir uma nova função.</w:t>
-      </w:r>
-    </w:p>
-    <w:p>
-      <w:pPr>
-        <w:pStyle w:val="Heading2"/>
-      </w:pPr>
-      <w:r>
-        <w:t>Lâmina 31 · As salas de aula</w:t>
-      </w:r>
-    </w:p>
-    <w:p>
-      <w:r>
-        <w:rPr>
-          <w:color w:val="666666"/>
-          <w:sz w:val="20"/>
-        </w:rPr>
-        <w:t>35 s  ·  ao final: 22:35</w:t>
-      </w:r>
-    </w:p>
-    <w:p>
-      <w:pPr>
-        <w:jc w:val="both"/>
-      </w:pPr>
-      <w:r>
-        <w:t>Nas salas fotografadas não havia nenhum dispositivo, enquanto o laboratório, no mesmo prédio, guardava computadores desligados. As crianças se alfabetizam com um alfabeto móvel feito à mão. Trato cada imagem como registro da configuração material visível naquele momento, sem valor de prova sobre as práticas ou as intenções dos profissionais. O sentido desse contraste para o trabalho da escola virá das entrevistas e dos documentos.</w:t>
+        <w:t>Na escola, o laboratório de informática foi fotografado com os equipamentos desligados. A imagem não diz há quanto tempo o espaço está assim nem por quê; essas perguntas ficam para as demais fontes. Segundo informação preliminar, ainda a confirmar no documento de aquisição, os computadores foram comprados pela Prefeitura em 2022, pouco antes da lei. Nas salas fotografadas não havia nenhum dispositivo, e as crianças se alfabetizam com um alfabeto móvel feito à mão. A política nacional encontra equipamentos de uma iniciativa municipal anterior e lhes atribui nova função. Chamamos essa situação de rugosidade tecnológica, com Santos, para quem a forma permanece aguardando o próximo movimento dinâmico da sociedade. Trato cada imagem como registro da configuração material visível naquele momento, sem valor de prova sobre as práticas dos profissionais.</w:t>
       </w:r>
     </w:p>
     <w:p>
@@ -1471,7 +1399,7 @@
         <w:pStyle w:val="Heading2"/>
       </w:pPr>
       <w:r>
-        <w:t>Lâmina 32 · Tese de partida</w:t>
+        <w:t>Lâmina 26 · Tese de partida e formulações</w:t>
       </w:r>
     </w:p>
     <w:p>
@@ -1480,7 +1408,7 @@
           <w:color w:val="666666"/>
           <w:sz w:val="20"/>
         </w:rPr>
-        <w:t>60 s  ·  ao final: 23:35</w:t>
+        <w:t>85 s  ·  ao final: 24:15</w:t>
       </w:r>
     </w:p>
     <w:p>
@@ -1489,7 +1417,7 @@
           <w:i/>
           <w:color w:val="555555"/>
         </w:rPr>
-        <w:t>[Ler a primeira frase da lâmina em tom mais lento. É o centro da apresentação.]</w:t>
+        <w:t>[Ler a tese de partida em tom mais lento. É o centro da apresentação.]</w:t>
       </w:r>
     </w:p>
     <w:p>
@@ -1497,7 +1425,7 @@
         <w:jc w:val="both"/>
       </w:pPr>
       <w:r>
-        <w:t>Com isso chego à tese de partida. A forma assumida pela PNED no cotidiano escolar resulta da relação entre o que ela prescreve e as condições sob as quais os profissionais precisam atuar. Dessa relação podem surgir adesão, acomodação, adaptação, omissão seletiva, negociação, ressignificação e resistência, e esta última permanece hipótese a examinar nos dados. As condições materiais fazem parte da política; Bowe, Ball e Gold já diziam que as políticas são intervenções textuais e carregam também restrições e possibilidades materiais. A pergunta vai, assim, além da verificação da implementação. Interessa saber o que acontece com uma política de educação digital quando encontra uma escola com uma história, condições e culturas profissionais determinadas, num território específico, e quem consegue, nessas condições, habitar o digital.</w:t>
+        <w:t>Com isso chego à tese de partida. A forma assumida pela PNED no cotidiano escolar resulta da relação entre o que ela prescreve e as condições sob as quais os profissionais precisam atuar. Dessa relação podem surgir adesão, acomodação, adaptação, omissão seletiva, negociação, ressignificação e resistência, e esta última permanece hipótese a examinar nos dados. As condições materiais fazem parte da política; Bowe, Ball e Gold já diziam que as políticas carregam restrições e possibilidades materiais. A tese chega à qualificação com três formulações para confrontar com o campo. Habitar o digital pergunta quem consegue habitar o digital, em que condições e com quais possibilidades de participação. Rugosidade tecnológica nomeia os equipamentos de 2022, anteriores à lei, chamados a cumprir nova função. Vazio material nomeia a exigência curricular com data marcada e meios sem mecanismo federativo obrigatório. As três poderão ser confirmadas, revistas ou abandonadas diante dos dados. A pergunta, assim, vai além da verificação da implementação e indaga o que acontece com uma política de educação digital quando encontra uma escola situada, num território específico, e quem consegue, nessas condições, habitar o digital.</w:t>
       </w:r>
     </w:p>
     <w:p>
@@ -1505,32 +1433,7 @@
         <w:pStyle w:val="Heading2"/>
       </w:pPr>
       <w:r>
-        <w:t>Lâmina 33 · Três formulações</w:t>
-      </w:r>
-    </w:p>
-    <w:p>
-      <w:r>
-        <w:rPr>
-          <w:color w:val="666666"/>
-          <w:sz w:val="20"/>
-        </w:rPr>
-        <w:t>40 s  ·  ao final: 24:15</w:t>
-      </w:r>
-    </w:p>
-    <w:p>
-      <w:pPr>
-        <w:jc w:val="both"/>
-      </w:pPr>
-      <w:r>
-        <w:t>A tese chega à qualificação com três formulações para confrontar com os dados. Habitar o digital é a contribuição conceitual própria e pergunta quem consegue habitar o digital, em que condições e com quais possibilidades de participação. Rugosidade tecnológica nomeia os equipamentos de 2022, anteriores à lei, chamados a cumprir nova função. Vazio material nomeia a exigência curricular com data marcada e meios sem mecanismo federativo obrigatório. As três poderão ser confirmadas, revistas ou abandonadas diante do campo.</w:t>
-      </w:r>
-    </w:p>
-    <w:p>
-      <w:pPr>
-        <w:pStyle w:val="Heading2"/>
-      </w:pPr>
-      <w:r>
-        <w:t>Lâmina 34 · Próximos passos</w:t>
+        <w:t>Lâmina 27 · Próximos passos</w:t>
       </w:r>
     </w:p>
     <w:p>
@@ -1555,7 +1458,7 @@
         <w:pStyle w:val="Heading2"/>
       </w:pPr>
       <w:r>
-        <w:t>Lâmina 35 · Agradecimento</w:t>
+        <w:t>Lâmina 28 · Agradecimento</w:t>
       </w:r>
     </w:p>
     <w:p>
@@ -1580,6 +1483,66 @@
         <w:pStyle w:val="Heading1"/>
       </w:pPr>
       <w:r>
+        <w:t>REFERÊNCIAS</w:t>
+      </w:r>
+    </w:p>
+    <w:p>
+      <w:pPr>
+        <w:pStyle w:val="Heading2"/>
+      </w:pPr>
+      <w:r>
+        <w:t>Lâmina 29 · Referências (1/2)</w:t>
+      </w:r>
+    </w:p>
+    <w:p>
+      <w:r>
+        <w:rPr>
+          <w:color w:val="666666"/>
+          <w:sz w:val="20"/>
+        </w:rPr>
+        <w:t>0 s  ·  ao final: 25:00</w:t>
+      </w:r>
+    </w:p>
+    <w:p>
+      <w:r>
+        <w:rPr>
+          <w:i/>
+          <w:color w:val="555555"/>
+        </w:rPr>
+        <w:t>[Sem fala. Deixar à disposição da banca durante a arguição.]</w:t>
+      </w:r>
+    </w:p>
+    <w:p>
+      <w:pPr>
+        <w:pStyle w:val="Heading2"/>
+      </w:pPr>
+      <w:r>
+        <w:t>Lâmina 30 · Referências (2/2)</w:t>
+      </w:r>
+    </w:p>
+    <w:p>
+      <w:r>
+        <w:rPr>
+          <w:color w:val="666666"/>
+          <w:sz w:val="20"/>
+        </w:rPr>
+        <w:t>0 s  ·  ao final: 25:00</w:t>
+      </w:r>
+    </w:p>
+    <w:p>
+      <w:r>
+        <w:rPr>
+          <w:i/>
+          <w:color w:val="555555"/>
+        </w:rPr>
+        <w:t>[Sem fala.]</w:t>
+      </w:r>
+    </w:p>
+    <w:p>
+      <w:pPr>
+        <w:pStyle w:val="Heading1"/>
+      </w:pPr>
+      <w:r>
         <w:t>Se o tempo apertar</w:t>
       </w:r>
     </w:p>
@@ -1591,10 +1554,10 @@
         <w:rPr>
           <w:b/>
         </w:rPr>
-        <w:t xml:space="preserve">Lâmina 17 (plataformas): </w:t>
+        <w:t xml:space="preserve">Lâmina 20 (mapa): </w:t>
       </w:r>
       <w:r>
-        <w:t>reduzir a uma frase: "Plataformas e dados entram como contexto teórico, pelo Eixo 6 da entrevista, com Zuboff, Silveira, Morozov e Pretto." Ganho de cerca de 25 s.</w:t>
+        <w:t>dizer só a primeira e a terceira frases e apontar o mapa, sem citar os países. Ganho de cerca de 40 s.</w:t>
       </w:r>
     </w:p>
     <w:p>
@@ -1605,10 +1568,10 @@
         <w:rPr>
           <w:b/>
         </w:rPr>
-        <w:t xml:space="preserve">Lâmina 18 (lentes): </w:t>
+        <w:t xml:space="preserve">Lâmina 15 (território e habitar): </w:t>
       </w:r>
       <w:r>
-        <w:t>dizer apenas a primeira frase e apontar os cartões. Ganho de cerca de 20 s.</w:t>
+        <w:t>omitir a frase sobre plataformas e dados. Ganho de cerca de 20 s.</w:t>
       </w:r>
     </w:p>
     <w:p>
@@ -1619,10 +1582,10 @@
         <w:rPr>
           <w:b/>
         </w:rPr>
-        <w:t xml:space="preserve">Lâmina 25 (agendas): </w:t>
+        <w:t xml:space="preserve">Lâmina 21 (comparação): </w:t>
       </w:r>
       <w:r>
-        <w:t>dizer só a frase sobre o deslocamento do foco e as cinco categorias. Ganho de cerca de 20 s.</w:t>
+        <w:t>nomear as cinco categorias e ler apenas a pergunta final. Ganho de cerca de 30 s.</w:t>
       </w:r>
     </w:p>
     <w:p>
@@ -1633,10 +1596,10 @@
         <w:rPr>
           <w:b/>
         </w:rPr>
-        <w:t xml:space="preserve">Lâmina 22 (movimentos): </w:t>
+        <w:t xml:space="preserve">Lâmina 17 (desenho e participantes): </w:t>
       </w:r>
       <w:r>
-        <w:t>nomear os cinco movimentos sem detalhar as fontes. Ganho de cerca de 20 s.</w:t>
+        <w:t>dizer "24 profissionais e um técnico da Secretaria", sem listar as funções. Ganho de cerca de 15 s.</w:t>
       </w:r>
     </w:p>
     <w:p>
@@ -1687,6 +1650,20 @@
       </w:r>
       <w:r>
         <w:t>o objeto é a encenação pelos profissionais; o que se disser sobre as crianças virá das condições documentadas e das compreensões dos profissionais.</w:t>
+      </w:r>
+    </w:p>
+    <w:p>
+      <w:pPr>
+        <w:pStyle w:val="ListBullet"/>
+      </w:pPr>
+      <w:r>
+        <w:rPr>
+          <w:b/>
+        </w:rPr>
+        <w:t xml:space="preserve">Por que essas cinco categorias: </w:t>
+      </w:r>
+      <w:r>
+        <w:t>saem das recorrências da comparação entre Europa e Américas (Quadro 12) e funcionam como lentes sensibilizadoras, abertas ao que o campo trouxer.</w:t>
       </w:r>
     </w:p>
     <w:p>

</xml_diff>

<commit_message>
Leva a questão aberta da pesquisa ao slide 27 e ajusta o roteiro
Co-Authored-By: Claude Opus 5.5 <noreply@anthropic.com>
Claude-Session: https://claude.ai/code/session_01HxStpW4pQoDfJdTDYr6zEC
</commit_message>
<xml_diff>
--- a/apresentacao_qualificacao/ROTEIRO_DE_FALA_25min.docx
+++ b/apresentacao_qualificacao/ROTEIRO_DE_FALA_25min.docx
@@ -44,7 +44,7 @@
         <w:pStyle w:val="ListBullet"/>
       </w:pPr>
       <w:r>
-        <w:t>O texto tem 2937 palavras, o que dá cerca de 23 minutos de fala a 125 palavras por minuto, ritmo pausado. Os 2 minutos restantes ficam para as trocas de lâmina, as pausas e o tempo de apontar fotos e mapa. Se o ensaio cronometrado der mais de 26 minutos, use os cortes sugeridos no fim do documento.</w:t>
+        <w:t>O texto tem 2973 palavras, o que dá cerca de 24 minutos de fala a 125 palavras por minuto, ritmo pausado. Os 1 minutos restantes ficam para as trocas de lâmina, as pausas e o tempo de apontar fotos e mapa. Se o ensaio cronometrado der mais de 26 minutos, use os cortes sugeridos no fim do documento.</w:t>
       </w:r>
     </w:p>
     <w:p>
@@ -52,7 +52,7 @@
         <w:pStyle w:val="ListBullet"/>
       </w:pPr>
       <w:r>
-        <w:t>Cada lâmina traz o tempo previsto e o tempo acumulado ao final dela. Os três pontos de controle mais úteis são: fim da lâmina 11 por volta de 09:50, fim da lâmina 18 por volta de 16:25 e fim da lâmina 25 por volta de 22:50.</w:t>
+        <w:t>Cada lâmina traz o tempo previsto e o tempo acumulado ao final dela. Os três pontos de controle mais úteis são: fim da lâmina 11 por volta de 09:50, fim da lâmina 18 por volta de 16:25 e fim da lâmina 25 por volta de 22:25.</w:t>
       </w:r>
     </w:p>
     <w:p>
@@ -390,7 +390,7 @@
           </w:tcPr>
           <w:p>
             <w:r>
-              <w:t>04:00</w:t>
+              <w:t>03:50</w:t>
             </w:r>
           </w:p>
         </w:tc>
@@ -400,7 +400,7 @@
           </w:tcPr>
           <w:p>
             <w:r>
-              <w:t>20:25</w:t>
+              <w:t>20:15</w:t>
             </w:r>
           </w:p>
         </w:tc>
@@ -432,7 +432,7 @@
           </w:tcPr>
           <w:p>
             <w:r>
-              <w:t>02:25</w:t>
+              <w:t>02:10</w:t>
             </w:r>
           </w:p>
         </w:tc>
@@ -442,7 +442,7 @@
           </w:tcPr>
           <w:p>
             <w:r>
-              <w:t>22:50</w:t>
+              <w:t>22:25</w:t>
             </w:r>
           </w:p>
         </w:tc>
@@ -474,7 +474,7 @@
           </w:tcPr>
           <w:p>
             <w:r>
-              <w:t>02:10</w:t>
+              <w:t>02:35</w:t>
             </w:r>
           </w:p>
         </w:tc>
@@ -1206,7 +1206,7 @@
           <w:color w:val="666666"/>
           <w:sz w:val="20"/>
         </w:rPr>
-        <w:t>85 s  ·  ao final: 18:00</w:t>
+        <w:t>75 s  ·  ao final: 17:50</w:t>
       </w:r>
     </w:p>
     <w:p>
@@ -1223,7 +1223,7 @@
         <w:jc w:val="both"/>
       </w:pPr>
       <w:r>
-        <w:t>O capítulo começa pelas agendas da UNESCO, da OCDE e do Banco Mundial, que, com suas diferenças, deslocam o foco da presença dos recursos para as condições, os usos e as finalidades. Em seguida, compara experiências de outros territórios. O mapa reúne nove casos nas Américas, dez na Europa e o Brasil em destaque, e a cor indica a categoria principal que cada experiência informa. Na lista ao lado está o foco de cada política. Nos Estados Unidos, os fossos de acesso, desenho e uso; no Uruguai, o Plan Ceibal, com acesso universal e continuidade entre governos; na Argentina, três reversões normativas em quinze anos; no Peru, ampliação do acesso sem ganhos equivalentes de aprendizagem. Na Europa, a União Europeia oferece referenciais comuns e uma estratégia de proteção infantil; a Alemanha mostra que recursos não substituem a coordenação entre escalas; na Itália, o acesso igual conviveu com usos desiguais; e a Finlândia delega ao município a decisão sobre o uso das tecnologias, cadeia parecida com a que acompanhamos em Tibau do Sul.</w:t>
+        <w:t>O capítulo começa pelas agendas da UNESCO, da OCDE e do Banco Mundial, que, com suas diferenças, deslocam o foco da presença dos recursos para as condições, os usos e as finalidades. Em seguida, compara experiências de outros territórios. O mapa reúne nove casos nas Américas, dez na Europa e o Brasil em destaque, e a cor indica a categoria principal que cada experiência informa. Na lista ao lado está o foco de cada política. Nos Estados Unidos, os fossos de acesso, desenho e uso; no Uruguai, o Plan Ceibal, com acesso universal e continuidade entre governos; na Argentina, três reversões normativas em quinze anos. Na Europa, a União Europeia oferece referenciais comuns e uma estratégia de proteção infantil; a Alemanha mostra que recursos não substituem a coordenação entre escalas; e a Finlândia delega ao município a decisão sobre o uso das tecnologias, cadeia parecida com a que acompanhamos em Tibau do Sul.</w:t>
       </w:r>
     </w:p>
     <w:p>
@@ -1240,7 +1240,7 @@
           <w:color w:val="666666"/>
           <w:sz w:val="20"/>
         </w:rPr>
-        <w:t>75 s  ·  ao final: 19:15</w:t>
+        <w:t>75 s  ·  ao final: 19:05</w:t>
       </w:r>
     </w:p>
     <w:p>
@@ -1274,7 +1274,7 @@
           <w:color w:val="666666"/>
           <w:sz w:val="20"/>
         </w:rPr>
-        <w:t>70 s  ·  ao final: 20:25</w:t>
+        <w:t>70 s  ·  ao final: 20:15</w:t>
       </w:r>
     </w:p>
     <w:p>
@@ -1316,7 +1316,7 @@
           <w:color w:val="666666"/>
           <w:sz w:val="20"/>
         </w:rPr>
-        <w:t>10 s  ·  ao final: 20:35</w:t>
+        <w:t>10 s  ·  ao final: 20:25</w:t>
       </w:r>
     </w:p>
     <w:p>
@@ -1341,7 +1341,7 @@
           <w:color w:val="666666"/>
           <w:sz w:val="20"/>
         </w:rPr>
-        <w:t>65 s  ·  ao final: 21:40</w:t>
+        <w:t>60 s  ·  ao final: 21:25</w:t>
       </w:r>
     </w:p>
     <w:p>
@@ -1375,7 +1375,7 @@
           <w:color w:val="666666"/>
           <w:sz w:val="20"/>
         </w:rPr>
-        <w:t>70 s  ·  ao final: 22:50</w:t>
+        <w:t>60 s  ·  ao final: 22:25</w:t>
       </w:r>
     </w:p>
     <w:p>
@@ -1408,7 +1408,7 @@
           <w:color w:val="666666"/>
           <w:sz w:val="20"/>
         </w:rPr>
-        <w:t>85 s  ·  ao final: 24:15</w:t>
+        <w:t>85 s  ·  ao final: 23:50</w:t>
       </w:r>
     </w:p>
     <w:p>
@@ -1433,7 +1433,7 @@
         <w:pStyle w:val="Heading2"/>
       </w:pPr>
       <w:r>
-        <w:t>Lâmina 27 · Próximos passos</w:t>
+        <w:t>Lâmina 27 · A questão aberta e os próximos passos</w:t>
       </w:r>
     </w:p>
     <w:p>
@@ -1442,7 +1442,16 @@
           <w:color w:val="666666"/>
           <w:sz w:val="20"/>
         </w:rPr>
-        <w:t>30 s  ·  ao final: 24:45</w:t>
+        <w:t>55 s  ·  ao final: 24:45</w:t>
+      </w:r>
+    </w:p>
+    <w:p>
+      <w:r>
+        <w:rPr>
+          <w:i/>
+          <w:color w:val="555555"/>
+        </w:rPr>
+        <w:t>[Pausa antes de ler as duas perguntas do cartão amarelo, em tom mais lento.]</w:t>
       </w:r>
     </w:p>
     <w:p>
@@ -1450,7 +1459,7 @@
         <w:jc w:val="both"/>
       </w:pPr>
       <w:r>
-        <w:t>Os próximos passos são submeter a emenda ao Comitê de Ética, realizar o campo em dez semanas após a aprovação, completar a análise documental, com os cadernos do laboratório, o documento de aquisição e os dados fiscais do município, e escrever o capítulo 7, com as narrativas dos profissionais. E incorporar as contribuições desta banca.</w:t>
+        <w:t>Termino com a questão que atravessa toda a pesquisa. A política fez da educação digital um direito e deixou os meios na dependência de cada ente federado. A pergunta de fundo, que só as narrativas dos profissionais podem responder, é esta: quando a política não faz chegar o equipamento nem a formação, quem paga, no silêncio do cotidiano escolar, o preço dessa ausência? E o que isso significa para os direitos que a lei prometeu às crianças? Para respondê-la, os próximos passos são submeter a emenda ao Comitê de Ética, realizar o campo em dez semanas, completar a análise documental e escrever o capítulo 7, incorporando as contribuições desta banca.</w:t>
       </w:r>
     </w:p>
     <w:p>

</xml_diff>

<commit_message>
Registra que os documentos já foram solicitados à direção e à Secretaria
Co-Authored-By: Claude Opus 5.5 <noreply@anthropic.com>
Claude-Session: https://claude.ai/code/session_01HxStpW4pQoDfJdTDYr6zEC
</commit_message>
<xml_diff>
--- a/apresentacao_qualificacao/ROTEIRO_DE_FALA_25min.docx
+++ b/apresentacao_qualificacao/ROTEIRO_DE_FALA_25min.docx
@@ -44,7 +44,7 @@
         <w:pStyle w:val="ListBullet"/>
       </w:pPr>
       <w:r>
-        <w:t>O texto tem 2973 palavras, o que dá cerca de 24 minutos de fala a 125 palavras por minuto, ritmo pausado. Os 1 minutos restantes ficam para as trocas de lâmina, as pausas e o tempo de apontar fotos e mapa. Se o ensaio cronometrado der mais de 26 minutos, use os cortes sugeridos no fim do documento.</w:t>
+        <w:t>O texto tem 3005 palavras, o que dá cerca de 24 minutos de fala a 125 palavras por minuto, ritmo pausado. Os 1 minutos restantes ficam para as trocas de lâmina, as pausas e o tempo de apontar fotos e mapa. Se o ensaio cronometrado der mais de 26 minutos, use os cortes sugeridos no fim do documento.</w:t>
       </w:r>
     </w:p>
     <w:p>
@@ -52,7 +52,7 @@
         <w:pStyle w:val="ListBullet"/>
       </w:pPr>
       <w:r>
-        <w:t>Cada lâmina traz o tempo previsto e o tempo acumulado ao final dela. Os três pontos de controle mais úteis são: fim da lâmina 11 por volta de 09:50, fim da lâmina 18 por volta de 16:25 e fim da lâmina 25 por volta de 22:25.</w:t>
+        <w:t>Cada lâmina traz o tempo previsto e o tempo acumulado ao final dela. Os três pontos de controle mais úteis são: fim da lâmina 11 por volta de 09:40, fim da lâmina 18 por volta de 16:20 e fim da lâmina 25 por volta de 22:20.</w:t>
       </w:r>
     </w:p>
     <w:p>
@@ -222,7 +222,7 @@
           </w:tcPr>
           <w:p>
             <w:r>
-              <w:t>06:20</w:t>
+              <w:t>06:15</w:t>
             </w:r>
           </w:p>
         </w:tc>
@@ -232,7 +232,7 @@
           </w:tcPr>
           <w:p>
             <w:r>
-              <w:t>07:15</w:t>
+              <w:t>07:10</w:t>
             </w:r>
           </w:p>
         </w:tc>
@@ -264,7 +264,7 @@
           </w:tcPr>
           <w:p>
             <w:r>
-              <w:t>02:35</w:t>
+              <w:t>02:30</w:t>
             </w:r>
           </w:p>
         </w:tc>
@@ -274,7 +274,7 @@
           </w:tcPr>
           <w:p>
             <w:r>
-              <w:t>09:50</w:t>
+              <w:t>09:40</w:t>
             </w:r>
           </w:p>
         </w:tc>
@@ -316,7 +316,7 @@
           </w:tcPr>
           <w:p>
             <w:r>
-              <w:t>14:15</w:t>
+              <w:t>14:05</w:t>
             </w:r>
           </w:p>
         </w:tc>
@@ -348,7 +348,7 @@
           </w:tcPr>
           <w:p>
             <w:r>
-              <w:t>02:10</w:t>
+              <w:t>02:15</w:t>
             </w:r>
           </w:p>
         </w:tc>
@@ -358,7 +358,7 @@
           </w:tcPr>
           <w:p>
             <w:r>
-              <w:t>16:25</w:t>
+              <w:t>16:20</w:t>
             </w:r>
           </w:p>
         </w:tc>
@@ -400,7 +400,7 @@
           </w:tcPr>
           <w:p>
             <w:r>
-              <w:t>20:15</w:t>
+              <w:t>20:10</w:t>
             </w:r>
           </w:p>
         </w:tc>
@@ -442,7 +442,7 @@
           </w:tcPr>
           <w:p>
             <w:r>
-              <w:t>22:25</w:t>
+              <w:t>22:20</w:t>
             </w:r>
           </w:p>
         </w:tc>
@@ -474,7 +474,7 @@
           </w:tcPr>
           <w:p>
             <w:r>
-              <w:t>02:35</w:t>
+              <w:t>02:40</w:t>
             </w:r>
           </w:p>
         </w:tc>
@@ -847,7 +847,7 @@
           <w:color w:val="666666"/>
           <w:sz w:val="20"/>
         </w:rPr>
-        <w:t>50 s  ·  ao final: 07:15</w:t>
+        <w:t>45 s  ·  ao final: 07:10</w:t>
       </w:r>
     </w:p>
     <w:p>
@@ -880,7 +880,7 @@
           <w:color w:val="666666"/>
           <w:sz w:val="20"/>
         </w:rPr>
-        <w:t>10 s  ·  ao final: 07:25</w:t>
+        <w:t>10 s  ·  ao final: 07:20</w:t>
       </w:r>
     </w:p>
     <w:p>
@@ -905,7 +905,7 @@
           <w:color w:val="666666"/>
           <w:sz w:val="20"/>
         </w:rPr>
-        <w:t>60 s  ·  ao final: 08:25</w:t>
+        <w:t>55 s  ·  ao final: 08:15</w:t>
       </w:r>
     </w:p>
     <w:p>
@@ -930,7 +930,7 @@
           <w:color w:val="666666"/>
           <w:sz w:val="20"/>
         </w:rPr>
-        <w:t>85 s  ·  ao final: 09:50</w:t>
+        <w:t>85 s  ·  ao final: 09:40</w:t>
       </w:r>
     </w:p>
     <w:p>
@@ -972,7 +972,7 @@
           <w:color w:val="666666"/>
           <w:sz w:val="20"/>
         </w:rPr>
-        <w:t>10 s  ·  ao final: 10:00</w:t>
+        <w:t>10 s  ·  ao final: 09:50</w:t>
       </w:r>
     </w:p>
     <w:p>
@@ -997,7 +997,7 @@
           <w:color w:val="666666"/>
           <w:sz w:val="20"/>
         </w:rPr>
-        <w:t>85 s  ·  ao final: 11:25</w:t>
+        <w:t>85 s  ·  ao final: 11:15</w:t>
       </w:r>
     </w:p>
     <w:p>
@@ -1031,7 +1031,7 @@
           <w:color w:val="666666"/>
           <w:sz w:val="20"/>
         </w:rPr>
-        <w:t>85 s  ·  ao final: 12:50</w:t>
+        <w:t>85 s  ·  ao final: 12:40</w:t>
       </w:r>
     </w:p>
     <w:p>
@@ -1056,7 +1056,7 @@
           <w:color w:val="666666"/>
           <w:sz w:val="20"/>
         </w:rPr>
-        <w:t>85 s  ·  ao final: 14:15</w:t>
+        <w:t>85 s  ·  ao final: 14:05</w:t>
       </w:r>
     </w:p>
     <w:p>
@@ -1098,7 +1098,7 @@
           <w:color w:val="666666"/>
           <w:sz w:val="20"/>
         </w:rPr>
-        <w:t>10 s  ·  ao final: 14:25</w:t>
+        <w:t>10 s  ·  ao final: 14:15</w:t>
       </w:r>
     </w:p>
     <w:p>
@@ -1123,7 +1123,7 @@
           <w:color w:val="666666"/>
           <w:sz w:val="20"/>
         </w:rPr>
-        <w:t>60 s  ·  ao final: 15:25</w:t>
+        <w:t>60 s  ·  ao final: 15:15</w:t>
       </w:r>
     </w:p>
     <w:p>
@@ -1148,7 +1148,7 @@
           <w:color w:val="666666"/>
           <w:sz w:val="20"/>
         </w:rPr>
-        <w:t>60 s  ·  ao final: 16:25</w:t>
+        <w:t>65 s  ·  ao final: 16:20</w:t>
       </w:r>
     </w:p>
     <w:p>
@@ -1156,7 +1156,7 @@
         <w:jc w:val="both"/>
       </w:pPr>
       <w:r>
-        <w:t>Os dados serão construídos em cinco movimentos. O primeiro é a análise documental, da lei e da resolução de 2025 ao Projeto Político-Pedagógico, aos planos, às atas e aos registros da Secretaria. O segundo é o registro iconográfico, com 38 imagens da escola e do Museu Digital de Pipa, já realizado. O terceiro é o questionário de perfil e primeiras percepções; o quarto, as entrevistas semiestruturadas, de 60 a 90 minutos; o quinto reúne as fontes na análise e devolve os resultados à escola e à Secretaria. A pesquisa vai ao Comitê de Ética como emenda ao protocolo já aprovado, com Termo de Consentimento, pseudônimos e as Resoluções 466 e 510, e o campo ocupa dez semanas depois da aprovação.</w:t>
+        <w:t>Os dados serão construídos em cinco movimentos. O primeiro é a análise documental, da lei e da resolução de 2025 ao Projeto Político-Pedagógico, aos planos, às atas e aos registros da Secretaria. O segundo é o registro iconográfico, com 38 imagens da escola e do Museu Digital de Pipa, já realizado. Os documentos da escola já foram solicitados à direção, e os municipais, ao técnico da Secretaria de Educação. O terceiro é o questionário de perfil e primeiras percepções; o quarto, as entrevistas semiestruturadas, de 60 a 90 minutos; o quinto reúne as fontes na análise e devolve os resultados à escola e à Secretaria. A pesquisa vai ao Comitê de Ética como emenda ao protocolo já aprovado, com Termo de Consentimento, pseudônimos e as Resoluções 466 e 510, e o campo ocupa dez semanas depois da aprovação.</w:t>
       </w:r>
     </w:p>
     <w:p>
@@ -1181,7 +1181,7 @@
           <w:color w:val="666666"/>
           <w:sz w:val="20"/>
         </w:rPr>
-        <w:t>10 s  ·  ao final: 16:35</w:t>
+        <w:t>10 s  ·  ao final: 16:30</w:t>
       </w:r>
     </w:p>
     <w:p>
@@ -1206,7 +1206,7 @@
           <w:color w:val="666666"/>
           <w:sz w:val="20"/>
         </w:rPr>
-        <w:t>75 s  ·  ao final: 17:50</w:t>
+        <w:t>75 s  ·  ao final: 17:45</w:t>
       </w:r>
     </w:p>
     <w:p>
@@ -1240,7 +1240,7 @@
           <w:color w:val="666666"/>
           <w:sz w:val="20"/>
         </w:rPr>
-        <w:t>75 s  ·  ao final: 19:05</w:t>
+        <w:t>75 s  ·  ao final: 19:00</w:t>
       </w:r>
     </w:p>
     <w:p>
@@ -1274,7 +1274,7 @@
           <w:color w:val="666666"/>
           <w:sz w:val="20"/>
         </w:rPr>
-        <w:t>70 s  ·  ao final: 20:15</w:t>
+        <w:t>70 s  ·  ao final: 20:10</w:t>
       </w:r>
     </w:p>
     <w:p>
@@ -1316,7 +1316,7 @@
           <w:color w:val="666666"/>
           <w:sz w:val="20"/>
         </w:rPr>
-        <w:t>10 s  ·  ao final: 20:25</w:t>
+        <w:t>10 s  ·  ao final: 20:20</w:t>
       </w:r>
     </w:p>
     <w:p>
@@ -1341,7 +1341,7 @@
           <w:color w:val="666666"/>
           <w:sz w:val="20"/>
         </w:rPr>
-        <w:t>60 s  ·  ao final: 21:25</w:t>
+        <w:t>60 s  ·  ao final: 21:20</w:t>
       </w:r>
     </w:p>
     <w:p>
@@ -1375,7 +1375,7 @@
           <w:color w:val="666666"/>
           <w:sz w:val="20"/>
         </w:rPr>
-        <w:t>60 s  ·  ao final: 22:25</w:t>
+        <w:t>60 s  ·  ao final: 22:20</w:t>
       </w:r>
     </w:p>
     <w:p>
@@ -1408,7 +1408,7 @@
           <w:color w:val="666666"/>
           <w:sz w:val="20"/>
         </w:rPr>
-        <w:t>85 s  ·  ao final: 23:50</w:t>
+        <w:t>85 s  ·  ao final: 23:45</w:t>
       </w:r>
     </w:p>
     <w:p>
@@ -1442,7 +1442,7 @@
           <w:color w:val="666666"/>
           <w:sz w:val="20"/>
         </w:rPr>
-        <w:t>55 s  ·  ao final: 24:45</w:t>
+        <w:t>60 s  ·  ao final: 24:45</w:t>
       </w:r>
     </w:p>
     <w:p>
@@ -1459,7 +1459,7 @@
         <w:jc w:val="both"/>
       </w:pPr>
       <w:r>
-        <w:t>Termino com a questão que atravessa toda a pesquisa. A política fez da educação digital um direito e deixou os meios na dependência de cada ente federado. A pergunta de fundo, que só as narrativas dos profissionais podem responder, é esta: quando a política não faz chegar o equipamento nem a formação, quem paga, no cotidiano escolar, por esse vazio material e formativo? E o que isso significa para os direitos que a lei prometeu às crianças? Para respondê-la, os próximos passos são submeter a emenda ao Comitê de Ética, realizar o campo em dez semanas, completar a análise documental e escrever o capítulo 7, incorporando as contribuições desta banca.</w:t>
+        <w:t>Termino com a questão que atravessa toda a pesquisa. A política fez da educação digital um direito e deixou os meios na dependência de cada ente federado. A pergunta de fundo, que só as narrativas dos profissionais podem responder, é esta: quando a política não faz chegar o equipamento nem a formação, quem paga, no cotidiano escolar, por esse vazio material e formativo? E o que isso significa para os direitos que a lei prometeu às crianças? Para respondê-la, os próximos passos são submeter a emenda ao Comitê de Ética, realizar o campo em dez semanas, completar a análise documental, com os documentos já solicitados à direção da escola e ao técnico da Secretaria, e escrever o capítulo 7, incorporando as contribuições desta banca.</w:t>
       </w:r>
     </w:p>
     <w:p>

</xml_diff>

<commit_message>
Atualiza sumário, apresentação e roteiro de fala no desenho da Secretaria à escola
Sumário com o capítulo 6 reorganizado e o capítulo 7 alinhado aos
quatro objetivos; apresentação com título, objeto, questão e
objetivos novos, desenho em funil e lâmina sobre Tibau do Sul (31
lâminas); roteiro de fala de 25 minutos refeito.

Co-Authored-By: Claude Opus 5.5 <noreply@anthropic.com>
Claude-Session: https://claude.ai/code/session_01HxStpW4pQoDfJdTDYr6zEC
</commit_message>
<xml_diff>
--- a/apresentacao_qualificacao/ROTEIRO_DE_FALA_25min.docx
+++ b/apresentacao_qualificacao/ROTEIRO_DE_FALA_25min.docx
@@ -22,13 +22,13 @@
         <w:rPr>
           <w:i/>
         </w:rPr>
-        <w:t>A encenação da PNED em Pipa/RN: culturas profissionais, território e resistências no contexto da prática</w:t>
+        <w:t>A encenação da PNED em Tibau do Sul/RN: da Secretaria Municipal de Educação à escola de Pipa, entre culturas profissionais, território e resistências</w:t>
         <w:br/>
       </w:r>
       <w:r>
         <w:t>Yzynya Silva Rezende Machado · Orientadora: Profa. Dra. Maria Cristina Leandro de Paiva</w:t>
         <w:br/>
-        <w:t>Apresentação: Qualificacao_PNED_Pipa.pptx (30 lâminas, das quais as duas últimas são de referências) · Duração prevista: 25 minutos</w:t>
+        <w:t>Apresentação: Qualificacao_PNED_Pipa.pptx (31 lâminas, das quais as duas últimas são de referências) · Duração prevista: 25 minutos</w:t>
       </w:r>
     </w:p>
     <w:p>
@@ -44,7 +44,7 @@
         <w:pStyle w:val="ListBullet"/>
       </w:pPr>
       <w:r>
-        <w:t>O texto tem 3005 palavras, o que dá cerca de 24 minutos de fala a 125 palavras por minuto, ritmo pausado. Os 1 minutos restantes ficam para as trocas de lâmina, as pausas e o tempo de apontar fotos e mapa. Se o ensaio cronometrado der mais de 26 minutos, use os cortes sugeridos no fim do documento.</w:t>
+        <w:t>O texto tem 2961 palavras, o que dá cerca de 24 minutos de fala a 125 palavras por minuto, ritmo pausado. Os 1 minutos restantes ficam para as trocas de lâmina, as pausas e o tempo de apontar fotos e mapa. Se o ensaio cronometrado der mais de 26 minutos, use os cortes sugeridos no fim do documento.</w:t>
       </w:r>
     </w:p>
     <w:p>
@@ -52,7 +52,7 @@
         <w:pStyle w:val="ListBullet"/>
       </w:pPr>
       <w:r>
-        <w:t>Cada lâmina traz o tempo previsto e o tempo acumulado ao final dela. Os três pontos de controle mais úteis são: fim da lâmina 11 por volta de 09:40, fim da lâmina 18 por volta de 16:20 e fim da lâmina 25 por volta de 22:20.</w:t>
+        <w:t>Cada lâmina traz o tempo previsto e o tempo acumulado ao final dela. Os três pontos de controle mais úteis são: fim da lâmina 11 por volta de 09:40, fim da lâmina 18 por volta de 16:00 e fim da lâmina 26 por volta de 22:25.</w:t>
       </w:r>
     </w:p>
     <w:p>
@@ -222,7 +222,7 @@
           </w:tcPr>
           <w:p>
             <w:r>
-              <w:t>06:15</w:t>
+              <w:t>06:25</w:t>
             </w:r>
           </w:p>
         </w:tc>
@@ -232,7 +232,7 @@
           </w:tcPr>
           <w:p>
             <w:r>
-              <w:t>07:10</w:t>
+              <w:t>07:20</w:t>
             </w:r>
           </w:p>
         </w:tc>
@@ -264,7 +264,7 @@
           </w:tcPr>
           <w:p>
             <w:r>
-              <w:t>02:30</w:t>
+              <w:t>02:20</w:t>
             </w:r>
           </w:p>
         </w:tc>
@@ -306,7 +306,7 @@
           </w:tcPr>
           <w:p>
             <w:r>
-              <w:t>04:25</w:t>
+              <w:t>04:10</w:t>
             </w:r>
           </w:p>
         </w:tc>
@@ -316,7 +316,7 @@
           </w:tcPr>
           <w:p>
             <w:r>
-              <w:t>14:05</w:t>
+              <w:t>13:50</w:t>
             </w:r>
           </w:p>
         </w:tc>
@@ -348,7 +348,7 @@
           </w:tcPr>
           <w:p>
             <w:r>
-              <w:t>02:15</w:t>
+              <w:t>02:10</w:t>
             </w:r>
           </w:p>
         </w:tc>
@@ -358,7 +358,7 @@
           </w:tcPr>
           <w:p>
             <w:r>
-              <w:t>16:20</w:t>
+              <w:t>16:00</w:t>
             </w:r>
           </w:p>
         </w:tc>
@@ -390,7 +390,7 @@
           </w:tcPr>
           <w:p>
             <w:r>
-              <w:t>03:50</w:t>
+              <w:t>03:30</w:t>
             </w:r>
           </w:p>
         </w:tc>
@@ -400,7 +400,7 @@
           </w:tcPr>
           <w:p>
             <w:r>
-              <w:t>20:10</w:t>
+              <w:t>19:30</w:t>
             </w:r>
           </w:p>
         </w:tc>
@@ -412,7 +412,7 @@
           </w:tcPr>
           <w:p>
             <w:r>
-              <w:t>Território e escola</w:t>
+              <w:t>Do município à escola</w:t>
             </w:r>
           </w:p>
         </w:tc>
@@ -422,7 +422,7 @@
           </w:tcPr>
           <w:p>
             <w:r>
-              <w:t>23-25</w:t>
+              <w:t>23-26</w:t>
             </w:r>
           </w:p>
         </w:tc>
@@ -432,7 +432,7 @@
           </w:tcPr>
           <w:p>
             <w:r>
-              <w:t>02:10</w:t>
+              <w:t>02:55</w:t>
             </w:r>
           </w:p>
         </w:tc>
@@ -442,7 +442,7 @@
           </w:tcPr>
           <w:p>
             <w:r>
-              <w:t>22:20</w:t>
+              <w:t>22:25</w:t>
             </w:r>
           </w:p>
         </w:tc>
@@ -464,7 +464,7 @@
           </w:tcPr>
           <w:p>
             <w:r>
-              <w:t>26-28</w:t>
+              <w:t>27-29</w:t>
             </w:r>
           </w:p>
         </w:tc>
@@ -474,7 +474,7 @@
           </w:tcPr>
           <w:p>
             <w:r>
-              <w:t>02:40</w:t>
+              <w:t>02:35</w:t>
             </w:r>
           </w:p>
         </w:tc>
@@ -506,7 +506,7 @@
           </w:tcPr>
           <w:p>
             <w:r>
-              <w:t>29-30</w:t>
+              <w:t>30-31</w:t>
             </w:r>
           </w:p>
         </w:tc>
@@ -556,7 +556,7 @@
               <w:rPr>
                 <w:b/>
               </w:rPr>
-              <w:t>1-30</w:t>
+              <w:t>1-31</w:t>
             </w:r>
           </w:p>
         </w:tc>
@@ -636,7 +636,7 @@
         <w:jc w:val="both"/>
       </w:pPr>
       <w:r>
-        <w:t>Bom dia (ou boa tarde) a todas e a todos. Agradeço à banca pela leitura cuidadosa do texto e à professora Maria Cristina Leandro de Paiva pela orientação. Apresento o projeto de tese A encenação da PNED em Pipa/RN: culturas profissionais, território e resistências no contexto da prática. A fotografia é da entrada da Escola Municipal Domitila Castelo da Silva, onde a pesquisa acontece.</w:t>
+        <w:t>Bom dia (ou boa tarde) a todas e a todos. Agradeço à banca pela leitura cuidadosa do texto e à professora Maria Cristina Leandro de Paiva pela orientação. Apresento o projeto de tese A encenação da Política Nacional de Educação Digital em Tibau do Sul: da Secretaria Municipal de Educação à escola de Pipa, entre culturas profissionais, território e resistências. A fotografia é da entrada da Escola Municipal Domitila Castelo da Silva.</w:t>
       </w:r>
     </w:p>
     <w:p>
@@ -670,7 +670,7 @@
         <w:jc w:val="both"/>
       </w:pPr>
       <w:r>
-        <w:t>A apresentação segue a ordem do texto. Começo pelo objeto, pela questão e pelos objetivos. Passo à revisão sistemática, aos fundamentos teóricos e à metodologia. Depois trago a leitura da agenda global e da PNED e, por fim, o território e a escola, que me levam à tese de partida e aos próximos passos.</w:t>
+        <w:t>A apresentação segue a ordem do texto. Começo pelo objeto, pela questão e pelos objetivos. Passo à revisão sistemática, aos fundamentos teóricos e à metodologia. Depois trago a agenda global e a PNED e, por fim, o caminho do município à escola, que me leva à tese de partida e aos próximos passos.</w:t>
       </w:r>
     </w:p>
     <w:p>
@@ -703,7 +703,7 @@
         <w:jc w:val="both"/>
       </w:pPr>
       <w:r>
-        <w:t>O objeto desta tese é a Política Nacional de Educação Digital, instituída pela Lei nº 14.533, de 2023, no eixo que chega às escolas, a Educação Digital Escolar. Interessa-me o modo como os profissionais da educação interpretam, traduzem e recontextualizam essa política nos anos iniciais, do 1º ao 5º ano, da Escola Municipal Domitila Castelo da Silva, em Pipa, distrito de Tibau do Sul. Chamo de profissionais da educação todas as pessoas que, na escola, participam da construção da política: professoras e professores, coordenação pedagógica, direção e demais profissionais ligados aos processos pedagógicos ou à educação digital. Trabalho com a ideia de Ball, Maguire e Braun de que as atuações são coletivas, criativas e limitadas. A pergunta nasceu da convivência com esse território, onde trabalho há dezoito anos na rede municipal.</w:t>
+        <w:t>O objeto desta tese é a Política Nacional de Educação Digital, instituída pela Lei nº 14.533, de 2023, no eixo que chega às escolas, a Educação Digital Escolar. Acompanho essa política em forma de funil. Ela começa na Secretaria Municipal de Educação de Tibau do Sul, que a recebe e a traduz para uma rede de escolas situadas em localidades muito diferentes, e chega à Escola Municipal Domitila Castelo da Silva, em Pipa. Ali, os profissionais da educação dos anos iniciais a interpretam, traduzem e recontextualizam: professoras e professores, coordenação, direção e apoio pedagógico. Trabalho com a ideia de Ball, Maguire e Braun de que as atuações são coletivas, criativas e limitadas.</w:t>
       </w:r>
     </w:p>
     <w:p>
@@ -720,7 +720,7 @@
           <w:color w:val="666666"/>
           <w:sz w:val="20"/>
         </w:rPr>
-        <w:t>60 s  ·  ao final: 03:05</w:t>
+        <w:t>65 s  ·  ao final: 03:10</w:t>
       </w:r>
     </w:p>
     <w:p>
@@ -737,7 +737,7 @@
         <w:jc w:val="both"/>
       </w:pPr>
       <w:r>
-        <w:t>Daí a questão que orienta a pesquisa. Como os profissionais da educação encenam e recontextualizam a Política Nacional de Educação Digital no contexto da prática da Escola Municipal Domitila Castelo da Silva, em Pipa, e como as culturas profissionais, as condições materiais e institucionais da escola e as especificidades socioespaciais do território atravessam esse processo, produzindo diferentes formas de atuação, entre as quais podem emergir acomodações, negociações, ressignificações e resistências? Formulei a pergunta para manter aberto o seu resultado. Ainda não sabemos se a PNED será acolhida, adaptada, posta de lado ou contestada. A resistência, que está no título, entra como possibilidade a examinar nos dados, sem ser pressuposta.</w:t>
+        <w:t>Daí a questão que orienta a pesquisa. Como a Política Nacional de Educação Digital é recontextualizada pela Secretaria Municipal de Educação de Tibau do Sul, num território que reúne áreas urbanas e rurais, povoados com realidades distintas e uma comunidade quilombola, e como essa recontextualização chega à Escola Municipal Domitila Castelo da Silva, em Pipa, onde os profissionais a encenam, atravessados pelas culturas profissionais, pelas condições materiais e institucionais da escola e pelas especificidades do lugar? Ainda não sabemos se a PNED será acolhida, adaptada, posta de lado ou contestada. A resistência, que está no título, é uma possibilidade a examinar nos dados.</w:t>
       </w:r>
     </w:p>
     <w:p>
@@ -754,7 +754,7 @@
           <w:color w:val="666666"/>
           <w:sz w:val="20"/>
         </w:rPr>
-        <w:t>90 s  ·  ao final: 04:35</w:t>
+        <w:t>95 s  ·  ao final: 04:45</w:t>
       </w:r>
     </w:p>
     <w:p>
@@ -763,7 +763,7 @@
           <w:i/>
           <w:color w:val="555555"/>
         </w:rPr>
-        <w:t>[Cada cartão tem um rótulo: interpretação, condições e território, formas de atuação, crianças. Apontar o rótulo e destacar o verbo: compreender, analisar, identificar, discutir.]</w:t>
+        <w:t>[Cada cartão tem um rótulo: rede municipal, interpretação, condições e território, formas de atuação e crianças. Destacar os verbos: analisar, compreender, examinar, identificar.]</w:t>
       </w:r>
     </w:p>
     <w:p>
@@ -771,7 +771,7 @@
         <w:jc w:val="both"/>
       </w:pPr>
       <w:r>
-        <w:t>O objetivo geral é analisar como os profissionais da educação encenam e recontextualizam a Política Nacional de Educação Digital no contexto da prática da Escola Municipal Domitila Castelo da Silva, em Pipa, considerando as relações entre a política, as culturas profissionais, as condições materiais e institucionais da escola e as especificidades socioespaciais do território. Os objetivos específicos acompanham o caminho que a política percorre até as crianças. O primeiro é compreender como os diferentes profissionais da educação interpretam os textos da PNED e os discursos sobre educação digital, considerando suas experiências, crenças, valores e formas de organização do trabalho. O segundo, analisar como as condições materiais e institucionais da escola, articuladas às especificidades socioespaciais do território, atravessam a tradução e a recontextualização da PNED em ações, escolhas e práticas cotidianas. O terceiro, identificar as diferentes formas de atuação produzidas diante da política, com atenção às situações em que emergem adesão, acomodação, adaptação, omissão seletiva, negociação, ressignificação ou resistência. O quarto, discutir as implicações dessas formas de encenação para a educação digital das crianças, considerando a provisão, a proteção e a participação no ambiente digital.</w:t>
+        <w:t>O objetivo geral é analisar a recontextualização da Política Nacional de Educação Digital da Secretaria Municipal de Educação de Tibau do Sul até o contexto da prática da Escola Municipal Domitila Castelo da Silva, considerando a diversidade socioespacial do território municipal, as culturas profissionais e as condições materiais e institucionais da rede e da escola. Os quatro objetivos específicos seguem o funil. O primeiro, na rede municipal, é analisar a recontextualização da PNED pela Secretaria em planos, currículos, formações e orientações, considerando as especificidades das localidades, entre elas as áreas rurais e a comunidade quilombola de Sibaúma. O segundo é compreender a interpretação da política e das orientações municipais pelos profissionais da escola, à luz de suas experiências, crenças e valores. O terceiro é examinar a relação entre as condições materiais e institucionais da escola, articuladas às especificidades de Pipa, e a tradução da política em ações e escolhas cotidianas. O quarto é identificar as formas de atuação produzidas, da adesão à resistência, e suas implicações para a provisão, a proteção e a participação das crianças no ambiente digital.</w:t>
       </w:r>
     </w:p>
     <w:p>
@@ -788,7 +788,7 @@
           <w:color w:val="666666"/>
           <w:sz w:val="20"/>
         </w:rPr>
-        <w:t>50 s  ·  ao final: 05:25</w:t>
+        <w:t>50 s  ·  ao final: 05:35</w:t>
       </w:r>
     </w:p>
     <w:p>
@@ -822,7 +822,7 @@
           <w:color w:val="666666"/>
           <w:sz w:val="20"/>
         </w:rPr>
-        <w:t>60 s  ·  ao final: 06:25</w:t>
+        <w:t>60 s  ·  ao final: 06:35</w:t>
       </w:r>
     </w:p>
     <w:p>
@@ -830,7 +830,7 @@
         <w:jc w:val="both"/>
       </w:pPr>
       <w:r>
-        <w:t>Vejo cinco relevâncias nesta pesquisa. Para as crianças, porque o eixo lhes promete participação consciente e democrática e proteção dos dados, e, nos anos iniciais, a escola pode ser o primeiro espaço público em que o digital é discutido com alguém responsável pelo ensino. Para os profissionais, porque olhamos a política a partir de quem a faz acontecer, sem cobrar de cada um o que só o desenho da política poderia garantir. Para o território, porque em Pipa o mesmo distrito reúne uso econômico intenso das tecnologias e salas de aula sem telas. Para a ciência, porque a PNED é lida pelo contexto da prática, com contribuições às políticas educacionais, à educação digital e aos direitos das crianças. E para a rede, que receberá a devolutiva dos resultados.</w:t>
+        <w:t>Vejo cinco relevâncias nesta pesquisa. Para as crianças, porque o eixo lhes promete participação consciente e democrática e proteção dos dados, e nos anos iniciais a escola pode ser o primeiro espaço público em que o digital é discutido com alguém responsável pelo ensino. Para os profissionais, porque olhamos a política a partir de quem a faz acontecer, sem cobrar de cada um o que só o desenho da política poderia garantir. Para o território, porque Tibau do Sul reúne localidades muito distintas numa mesma rede, e em Pipa o uso econômico intenso das tecnologias convive com salas sem telas. Para a ciência, pela leitura da PNED a partir do contexto da prática. E para a rede, que saberá se a tradução municipal da política considera essas diferenças.</w:t>
       </w:r>
     </w:p>
     <w:p>
@@ -847,7 +847,7 @@
           <w:color w:val="666666"/>
           <w:sz w:val="20"/>
         </w:rPr>
-        <w:t>45 s  ·  ao final: 07:10</w:t>
+        <w:t>45 s  ·  ao final: 07:20</w:t>
       </w:r>
     </w:p>
     <w:p>
@@ -855,7 +855,7 @@
         <w:jc w:val="both"/>
       </w:pPr>
       <w:r>
-        <w:t>O ineditismo aparece em três planos. No empírico-temporal, acompanhamos a chegada da PNED à escola enquanto ela acontece: nenhum dos nove estudos reunidos na revisão examina essa política, e nenhum investiga uma rede municipal de pequeno porte. No analítico-espacial, Pipa entra como parte do contexto da prática, lida com Milton Santos, para quem a categoria de análise é o território usado, e com Doreen Massey, que pensa o lugar como encontro de trajetórias. No teórico-conceitual, articulamos atuação, culturas profissionais, materialidade e território, e dessa articulação nasce a formulação habitar o digital.</w:t>
+        <w:t>O ineditismo aparece em três planos. No empírico-temporal, acompanhamos a chegada da PNED da Secretaria à escola enquanto ela acontece: nenhum dos nove estudos da revisão examina essa política ou uma rede municipal de pequeno porte. No analítico-espacial, o território municipal, de Tibau do Sul a Pipa, entra como parte do contexto, lido com Milton Santos e com Doreen Massey. No teórico-conceitual, articulamos atuação, culturas profissionais, materialidade e território, e daí nasce a formulação habitar o digital.</w:t>
       </w:r>
     </w:p>
     <w:p>
@@ -880,7 +880,7 @@
           <w:color w:val="666666"/>
           <w:sz w:val="20"/>
         </w:rPr>
-        <w:t>10 s  ·  ao final: 07:20</w:t>
+        <w:t>10 s  ·  ao final: 07:30</w:t>
       </w:r>
     </w:p>
     <w:p>
@@ -905,7 +905,7 @@
           <w:color w:val="666666"/>
           <w:sz w:val="20"/>
         </w:rPr>
-        <w:t>55 s  ·  ao final: 08:15</w:t>
+        <w:t>50 s  ·  ao final: 08:20</w:t>
       </w:r>
     </w:p>
     <w:p>
@@ -930,7 +930,7 @@
           <w:color w:val="666666"/>
           <w:sz w:val="20"/>
         </w:rPr>
-        <w:t>85 s  ·  ao final: 09:40</w:t>
+        <w:t>80 s  ·  ao final: 09:40</w:t>
       </w:r>
     </w:p>
     <w:p>
@@ -947,7 +947,7 @@
         <w:jc w:val="both"/>
       </w:pPr>
       <w:r>
-        <w:t>A revisão orientou decisões da tese, e esta lâmina mostra cada uma delas. Os estudos tratam os anos iniciais em bloco e quase não delimitam o ciclo de alfabetização; por isso, a tese delimita o 1º ao 5º ano, com esse ciclo incluído. Nenhum estudo examina a PNED nem uma rede municipal de pequeno porte; a tese toma o eixo Educação Digital Escolar como objeto, na rede de Tibau do Sul. Predominam respostas emergenciais à pandemia; a tese estuda a política no funcionamento ordinário da escola. O corpus mostra que as condições vão além do equipamento e que os profissionais interpretam a política, e daí nasce a pergunta sobre o que eles fazem quando a condição anunciada não chega. Cultura digital e formação cidadã têm apoio frágil, e as crianças não aparecem como sujeitos; o tema será tratado de modo exploratório, ouvindo os profissionais, sem avaliar efeitos sobre as crianças. Por fim, os três eixos da revisão serviram de referência para o questionário e as entrevistas, sem virar categorias fechadas.</w:t>
+        <w:t>A revisão orientou decisões da tese, e esta lâmina mostra cada uma delas. Os estudos tratam os anos iniciais em bloco e quase não delimitam o ciclo de alfabetização; por isso, a tese delimita o 1º ao 5º ano, com esse ciclo incluído. Nenhum estudo examina a PNED nem uma rede municipal de pequeno porte; a tese toma o eixo Educação Digital Escolar como objeto, da Secretaria de Tibau do Sul à escola. Predominam respostas emergenciais à pandemia; a tese estuda a política no funcionamento ordinário da escola. O corpus mostra que as condições vão além do equipamento e que os profissionais interpretam a política, e daí nasce a pergunta sobre o que eles fazem quando a condição anunciada não chega. Cultura digital e formação cidadã têm apoio frágil, e as crianças não aparecem como sujeitos; o tema será tratado de modo exploratório, ouvindo os profissionais, sem avaliar efeitos sobre as crianças. Por fim, os três eixos da revisão serviram de referência para o questionário e as entrevistas, sem virar categorias fechadas.</w:t>
       </w:r>
     </w:p>
     <w:p>
@@ -997,7 +997,7 @@
           <w:color w:val="666666"/>
           <w:sz w:val="20"/>
         </w:rPr>
-        <w:t>85 s  ·  ao final: 11:15</w:t>
+        <w:t>80 s  ·  ao final: 11:10</w:t>
       </w:r>
     </w:p>
     <w:p>
@@ -1014,7 +1014,7 @@
         <w:jc w:val="both"/>
       </w:pPr>
       <w:r>
-        <w:t>O capítulo 3 organiza a teoria pelo caminho da política. A Abordagem do Ciclo de Políticas, de Bowe, Ball e Gold, sistematizada no Brasil por Mainardes, entende a política como processo contínuo, em que formulação e prática se influenciam. No contexto de influência, agendas e discursos disputam as finalidades da educação digital. No contexto da produção do texto, essas disputas ganham forma na Lei nº 14.533 e na Resolução CNE/CEB nº 2, e ali se lê o que a lei pede e com que meios. Esses dois contextos são examinados no capítulo 5. No contexto da prática, a política é posta em ato, e é aqui que entra a teoria da atuação de Ball, Maguire e Braun, com quatro dimensões: a situada, que traz Pipa e a história da escola; a das culturas profissionais; a material, com prédio, equipamentos e conexão; e a externa, com as orientações da rede. Esse contexto é tratado nos capítulos 6 e 7. Como lembram Bowe, Ball e Gold, os profissionais não leem os textos da política como leitores ingênuos.</w:t>
+        <w:t>O capítulo 3 organiza a teoria pelo caminho da política. A Abordagem do Ciclo de Políticas, de Bowe, Ball e Gold, sistematizada no Brasil por Mainardes, entende a política como processo contínuo, em que formulação e prática se influenciam. No contexto de influência, agendas e discursos disputam as finalidades da educação digital. No contexto da produção do texto, essas disputas ganham forma na Lei nº 14.533 e na Resolução CNE/CEB nº 2, e ali se lê o que a lei pede e com que meios. Esses dois contextos são examinados no capítulo 5. No contexto da prática, a política é posta em ato, primeiro na Secretaria, que a traduz para a rede, e depois na escola. É aqui que entra a teoria da atuação de Ball, Maguire e Braun, com quatro dimensões: a situada, que traz Pipa e a história da escola; a das culturas profissionais; a material, com prédio, equipamentos e conexão; e a externa, que nesta tese tem fonte própria na Secretaria. Esse contexto é tratado nos capítulos 6 e 7.</w:t>
       </w:r>
     </w:p>
     <w:p>
@@ -1031,7 +1031,7 @@
           <w:color w:val="666666"/>
           <w:sz w:val="20"/>
         </w:rPr>
-        <w:t>85 s  ·  ao final: 12:40</w:t>
+        <w:t>80 s  ·  ao final: 12:30</w:t>
       </w:r>
     </w:p>
     <w:p>
@@ -1056,7 +1056,7 @@
           <w:color w:val="666666"/>
           <w:sz w:val="20"/>
         </w:rPr>
-        <w:t>85 s  ·  ao final: 14:05</w:t>
+        <w:t>80 s  ·  ao final: 13:50</w:t>
       </w:r>
     </w:p>
     <w:p>
@@ -1073,7 +1073,7 @@
         <w:jc w:val="both"/>
       </w:pPr>
       <w:r>
-        <w:t>Falta dizer onde a política é posta em ato. Com Milton Santos, a categoria de análise é o território usado, e as rugosidades são o que fica do passado como forma e paisagem. Com Doreen Massey, o lugar é um encontro de trajetórias. Pipa é esse lugar, e as crianças da escola vêm de famílias de moradores antigos, de migrantes, de estrangeiros e de pessoas ligadas ao turismo. Desse diálogo, somado à tradição do habitar em Schlemmer, Backes e Palagi e em Di Felice, nasce a formulação própria da tese: habitar o digital designa as maneiras pelas quais as tecnologias digitais atravessam os espaços, as relações e as práticas cotidianas de um território, produzindo possibilidades desiguais de acesso, participação e apropriação. As plataformas e os dados, discutidos com Zuboff, Silveira, Morozov e Pretto, entram como contexto da proteção e da participação das crianças e chegam ao campo pelo eixo 6 da entrevista. A formulação será confrontada com os dados e poderá ser revista.</w:t>
+        <w:t>Falta dizer onde a política é posta em ato. Com Milton Santos, a categoria de análise é o território usado, e as rugosidades são o que fica do passado como forma e paisagem. Com Doreen Massey, o lugar é um encontro de trajetórias. Tibau do Sul reúne lugares assim, e em Pipa as crianças da escola vêm de famílias de moradores antigos, de migrantes, de estrangeiros e de pessoas ligadas ao turismo. Desse diálogo, somado à tradição do habitar em Schlemmer, Backes e Palagi e em Di Felice, nasce a formulação própria da tese: habitar o digital designa as maneiras pelas quais as tecnologias digitais atravessam os espaços, as relações e as práticas cotidianas de um território, produzindo possibilidades desiguais de acesso, participação e apropriação. A formulação será confrontada com os dados e poderá ser revista.</w:t>
       </w:r>
     </w:p>
     <w:p>
@@ -1098,7 +1098,7 @@
           <w:color w:val="666666"/>
           <w:sz w:val="20"/>
         </w:rPr>
-        <w:t>10 s  ·  ao final: 14:15</w:t>
+        <w:t>10 s  ·  ao final: 14:00</w:t>
       </w:r>
     </w:p>
     <w:p>
@@ -1123,7 +1123,7 @@
           <w:color w:val="666666"/>
           <w:sz w:val="20"/>
         </w:rPr>
-        <w:t>60 s  ·  ao final: 15:15</w:t>
+        <w:t>60 s  ·  ao final: 15:00</w:t>
       </w:r>
     </w:p>
     <w:p>
@@ -1131,7 +1131,7 @@
         <w:jc w:val="both"/>
       </w:pPr>
       <w:r>
-        <w:t>A pesquisa é qualitativa e interpretativa, como a define Minayo, e se organiza como estudo de caso, nos termos de Yin. A Secretaria Municipal de Educação entra como dimensão complementar do contexto externo. Não faremos observação de sala de aula, delimitação que Ball, Maguire e Braun também adotaram, e a análise será temática reflexiva, com Braun e Clarke. Podem participar 24 profissionais da escola: o diretor, a vice-diretora, a coordenadora pedagógica, quatro profissionais do apoio pedagógico, quinze regentes e dois que atuam no apoio à recomposição de aula, além de um técnico da Secretaria. A escola tem 351 crianças em quinze turmas, e elas não participam da produção de dados.</w:t>
+        <w:t>A pesquisa é qualitativa e interpretativa, como a define Minayo, e se organiza como estudo de caso único com unidades incorporadas, nos termos de Yin: o caso é a encenação da PNED na rede de Tibau do Sul, e as unidades são a Secretaria e a escola. A análise parte da rede e do território municipal e se estreita até a escola. Não faremos observação de aula, delimitação que Ball, Maguire e Braun também adotaram. Participam um técnico da Secretaria, cuja entrevista abre o campo, e 24 profissionais da escola. A escola tem 351 crianças em quinze turmas, que não participam da produção de dados.</w:t>
       </w:r>
     </w:p>
     <w:p>
@@ -1148,7 +1148,7 @@
           <w:color w:val="666666"/>
           <w:sz w:val="20"/>
         </w:rPr>
-        <w:t>65 s  ·  ao final: 16:20</w:t>
+        <w:t>60 s  ·  ao final: 16:00</w:t>
       </w:r>
     </w:p>
     <w:p>
@@ -1156,7 +1156,7 @@
         <w:jc w:val="both"/>
       </w:pPr>
       <w:r>
-        <w:t>Os dados serão construídos em cinco movimentos. O primeiro é a análise documental, da lei e da resolução de 2025 ao Projeto Político-Pedagógico, aos planos, às atas e aos registros da Secretaria. O segundo é o registro iconográfico, com 38 imagens da escola e do Museu Digital de Pipa, já realizado. Os documentos da escola já foram solicitados à direção, e os municipais, ao técnico da Secretaria de Educação. O terceiro é o questionário de perfil e primeiras percepções; o quarto, as entrevistas semiestruturadas, de 60 a 90 minutos; o quinto reúne as fontes na análise e devolve os resultados à escola e à Secretaria. A pesquisa vai ao Comitê de Ética como emenda ao protocolo já aprovado, com Termo de Consentimento, pseudônimos e as Resoluções 466 e 510, e o campo ocupa dez semanas depois da aprovação.</w:t>
+        <w:t>Os dados serão construídos em cinco movimentos, da rede à escola. O primeiro é a análise documental: o plano da rede, o currículo e as formações da Secretaria e, na escola, o Projeto Político-Pedagógico e os planos, documentos já solicitados ao técnico e à direção. O segundo lê o território municipal com dados do IBGE e do Censo Escolar e reúne as 38 imagens de Pipa e da escola. O terceiro é o questionário; o quarto, as entrevistas, começando pelo técnico; o quinto, a análise e a devolutiva. A emenda ao Comitê de Ética, com a Secretaria como coparticipante, ainda será submetida.</w:t>
       </w:r>
     </w:p>
     <w:p>
@@ -1181,7 +1181,7 @@
           <w:color w:val="666666"/>
           <w:sz w:val="20"/>
         </w:rPr>
-        <w:t>10 s  ·  ao final: 16:30</w:t>
+        <w:t>10 s  ·  ao final: 16:10</w:t>
       </w:r>
     </w:p>
     <w:p>
@@ -1206,7 +1206,7 @@
           <w:color w:val="666666"/>
           <w:sz w:val="20"/>
         </w:rPr>
-        <w:t>75 s  ·  ao final: 17:45</w:t>
+        <w:t>65 s  ·  ao final: 17:15</w:t>
       </w:r>
     </w:p>
     <w:p>
@@ -1223,7 +1223,7 @@
         <w:jc w:val="both"/>
       </w:pPr>
       <w:r>
-        <w:t>O capítulo começa pelas agendas da UNESCO, da OCDE e do Banco Mundial, que, com suas diferenças, deslocam o foco da presença dos recursos para as condições, os usos e as finalidades. Em seguida, compara experiências de outros territórios. O mapa reúne nove casos nas Américas, dez na Europa e o Brasil em destaque, e a cor indica a categoria principal que cada experiência informa. Na lista ao lado está o foco de cada política. Nos Estados Unidos, os fossos de acesso, desenho e uso; no Uruguai, o Plan Ceibal, com acesso universal e continuidade entre governos; na Argentina, três reversões normativas em quinze anos. Na Europa, a União Europeia oferece referenciais comuns e uma estratégia de proteção infantil; a Alemanha mostra que recursos não substituem a coordenação entre escalas; e a Finlândia delega ao município a decisão sobre o uso das tecnologias, cadeia parecida com a que acompanhamos em Tibau do Sul.</w:t>
+        <w:t>O capítulo começa pelas agendas da UNESCO, da OCDE e do Banco Mundial, que, com suas diferenças, deslocam o foco da presença dos recursos para as condições, os usos e as finalidades. Em seguida, compara experiências de outros territórios. O mapa reúne nove casos nas Américas, dez na Europa e o Brasil em destaque, e a cor indica a categoria principal que cada experiência informa. Nos Estados Unidos, os fossos de acesso, desenho e uso; no Uruguai, o Plan Ceibal, com acesso universal e continuidade entre governos; na Argentina, três reversões normativas em quinze anos. Na Europa, a União Europeia oferece referenciais comuns e uma estratégia de proteção infantil; a Alemanha mostra que recursos não substituem a coordenação entre escalas; e a Finlândia delega ao município a decisão sobre o uso das tecnologias, cadeia parecida com a que acompanhamos em Tibau do Sul.</w:t>
       </w:r>
     </w:p>
     <w:p>
@@ -1240,7 +1240,7 @@
           <w:color w:val="666666"/>
           <w:sz w:val="20"/>
         </w:rPr>
-        <w:t>75 s  ·  ao final: 19:00</w:t>
+        <w:t>65 s  ·  ao final: 18:20</w:t>
       </w:r>
     </w:p>
     <w:p>
@@ -1274,7 +1274,7 @@
           <w:color w:val="666666"/>
           <w:sz w:val="20"/>
         </w:rPr>
-        <w:t>70 s  ·  ao final: 20:10</w:t>
+        <w:t>70 s  ·  ao final: 19:30</w:t>
       </w:r>
     </w:p>
     <w:p>
@@ -1291,7 +1291,7 @@
         <w:jc w:val="both"/>
       </w:pPr>
       <w:r>
-        <w:t>A leitura da lei mostrou o ponto que considero mais frágil. De um lado está a exigência: a educação digital é componente curricular obrigatório desde a derrubada do veto, e a resolução de 2025 marcou a implementação para 2026. A formação aparece como ação de promoção. Do outro lado estão os meios: o eixo de inclusão digital se desenvolve dentro dos limites orçamentários de cada ente, e o artigo 11 não cria fundo próprio nem transferência obrigatória aos municípios. Numa rede pequena, esse desenho abre espaço para o que chamamos de vazio material: a exigência tem data, e os meios dependem da capacidade de cada rede. Trato isso como proposição a verificar. Para separar o desenho da lei da capacidade fiscal do município, ainda preciso reunir os dados de receita e de gasto em educação de Tibau do Sul.</w:t>
+        <w:t>A leitura da lei mostrou o ponto que considero mais frágil. De um lado está a exigência: a educação digital é componente curricular obrigatório desde a derrubada do veto, e a resolução de 2025 marcou a implementação para 2026. A formação aparece como ação de promoção. Do outro lado estão os meios: o eixo de inclusão digital se desenvolve dentro dos limites orçamentários de cada ente, e o artigo 11 não cria fundo próprio nem transferência obrigatória aos municípios. Numa rede pequena, esse desenho abre espaço para o que chamamos de vazio material: a exigência tem data, e os meios dependem da capacidade de cada rede, e a Secretaria ainda precisa decidir como distribuir o que tem entre localidades muito diferentes. Trato isso como proposição a verificar. Para separar o desenho da lei da capacidade fiscal do município, ainda preciso reunir os dados de receita e de gasto em educação de Tibau do Sul.</w:t>
       </w:r>
     </w:p>
     <w:p>
@@ -1299,7 +1299,7 @@
         <w:pStyle w:val="Heading1"/>
       </w:pPr>
       <w:r>
-        <w:t>TERRITÓRIO E ESCOLA</w:t>
+        <w:t>DO MUNICÍPIO À ESCOLA</w:t>
       </w:r>
     </w:p>
     <w:p>
@@ -1307,7 +1307,7 @@
         <w:pStyle w:val="Heading2"/>
       </w:pPr>
       <w:r>
-        <w:t>Lâmina 23 · Divisor: Território e escola</w:t>
+        <w:t>Lâmina 23 · Divisor: Do município à escola</w:t>
       </w:r>
     </w:p>
     <w:p>
@@ -1316,7 +1316,7 @@
           <w:color w:val="666666"/>
           <w:sz w:val="20"/>
         </w:rPr>
-        <w:t>10 s  ·  ao final: 20:20</w:t>
+        <w:t>10 s  ·  ao final: 19:40</w:t>
       </w:r>
     </w:p>
     <w:p>
@@ -1324,7 +1324,7 @@
         <w:jc w:val="both"/>
       </w:pPr>
       <w:r>
-        <w:t>Chego ao capítulo 6, que desloca o olhar para o território e a escola.</w:t>
+        <w:t>Chego ao capítulo 6, que percorre o caminho de Tibau do Sul até Pipa e até a escola.</w:t>
       </w:r>
     </w:p>
     <w:p>
@@ -1332,7 +1332,7 @@
         <w:pStyle w:val="Heading2"/>
       </w:pPr>
       <w:r>
-        <w:t>Lâmina 24 · Pipa</w:t>
+        <w:t>Lâmina 24 · Tibau do Sul</w:t>
       </w:r>
     </w:p>
     <w:p>
@@ -1341,7 +1341,41 @@
           <w:color w:val="666666"/>
           <w:sz w:val="20"/>
         </w:rPr>
-        <w:t>60 s  ·  ao final: 21:20</w:t>
+        <w:t>55 s  ·  ao final: 20:35</w:t>
+      </w:r>
+    </w:p>
+    <w:p>
+      <w:r>
+        <w:rPr>
+          <w:i/>
+          <w:color w:val="555555"/>
+        </w:rPr>
+        <w:t>[Apontar no mapa o litoral e a extensão do município.]</w:t>
+      </w:r>
+    </w:p>
+    <w:p>
+      <w:pPr>
+        <w:jc w:val="both"/>
+      </w:pPr>
+      <w:r>
+        <w:t>Tibau do Sul tem 102 quilômetros quadrados e tinha 16.929 habitantes no Censo de 2022; em 2010, cerca de 40% da população vivia em área rural, dado que ainda vou conferir. O IBGE reconhece só o distrito sede, mas o município se organiza em localidades muito diferentes: a sede, Pipa, Piau, os povoados rurais e Sibaúma, comunidade quilombola certificada pela Fundação Palmares em 2005. A rede tem escolas nesses lugares. Segundo o técnico da Secretaria, há um plano elaborado para a rede como um todo. A pergunta é se a tradução municipal da PNED considera essas diferenças.</w:t>
+      </w:r>
+    </w:p>
+    <w:p>
+      <w:pPr>
+        <w:pStyle w:val="Heading2"/>
+      </w:pPr>
+      <w:r>
+        <w:t>Lâmina 25 · Pipa</w:t>
+      </w:r>
+    </w:p>
+    <w:p>
+      <w:r>
+        <w:rPr>
+          <w:color w:val="666666"/>
+          <w:sz w:val="20"/>
+        </w:rPr>
+        <w:t>55 s  ·  ao final: 21:30</w:t>
       </w:r>
     </w:p>
     <w:p>
@@ -1358,7 +1392,7 @@
         <w:jc w:val="both"/>
       </w:pPr>
       <w:r>
-        <w:t>Nos anos 1970, Pipa era uma comunidade agrícola e pesqueira, sem energia elétrica, água encanada e boas vias de acesso. A partir de meados daquela década chegaram os surfistas, e a divulgação mais intensa nos anos 1990 trouxe turistas de várias partes do mundo, como reconstitui Aires. As fotografias mostram essa passagem: a construção artesanal de uma embarcação, um grupo de surfistas em abril de 1991 e a vista aérea atual, com pousadas e restaurantes que se vendem pela internet. Aires observa que a população nativa não foi passiva e que muitas paisagens ainda revelam materialidades de tempos passados, o que aproxima a história do distrito da noção de rugosidade. Massey nos impede de ler a distância entre escola e polo turístico como atraso: os dois são contemporâneos.</w:t>
+        <w:t>Nos anos 1970, Pipa era uma comunidade agrícola e pesqueira, sem energia elétrica, água encanada e boas vias de acesso. A partir de meados daquela década chegaram os surfistas, e a divulgação mais intensa nos anos 1990 trouxe turistas de várias partes do mundo, como reconstitui Aires. As fotografias mostram essa passagem: a construção artesanal de uma embarcação, um grupo de surfistas em abril de 1991 e a vista aérea atual, com pousadas e restaurantes que se vendem pela internet. Aires observa que a população nativa não foi passiva e que muitas paisagens ainda revelam materialidades de tempos passados, o que aproxima a história da localidade da noção de rugosidade. Massey nos impede de ler a distância entre escola e polo turístico como atraso: os dois são contemporâneos.</w:t>
       </w:r>
     </w:p>
     <w:p>
@@ -1366,7 +1400,7 @@
         <w:pStyle w:val="Heading2"/>
       </w:pPr>
       <w:r>
-        <w:t>Lâmina 25 · A escola</w:t>
+        <w:t>Lâmina 26 · A escola</w:t>
       </w:r>
     </w:p>
     <w:p>
@@ -1375,7 +1409,7 @@
           <w:color w:val="666666"/>
           <w:sz w:val="20"/>
         </w:rPr>
-        <w:t>60 s  ·  ao final: 22:20</w:t>
+        <w:t>55 s  ·  ao final: 22:25</w:t>
       </w:r>
     </w:p>
     <w:p>
@@ -1383,7 +1417,7 @@
         <w:jc w:val="both"/>
       </w:pPr>
       <w:r>
-        <w:t>Na escola, o laboratório de informática foi fotografado com os equipamentos desligados. A imagem não diz há quanto tempo o espaço está assim nem por quê; essas perguntas ficam para as demais fontes. Segundo informação preliminar, ainda a confirmar no documento de aquisição, os computadores foram comprados pela Prefeitura em 2022, pouco antes da lei. Nas salas fotografadas não havia nenhum dispositivo, e as crianças se alfabetizam com um alfabeto móvel feito à mão. A política nacional encontra equipamentos de uma iniciativa municipal anterior e lhes atribui nova função. Chamamos essa situação de rugosidade tecnológica, com Santos, para quem a forma permanece aguardando o próximo movimento dinâmico da sociedade. Trato cada imagem como registro da configuração material visível naquele momento, sem valor de prova sobre as práticas dos profissionais.</w:t>
+        <w:t>Na escola, o laboratório de informática foi fotografado com os equipamentos desligados. A imagem não diz há quanto tempo o espaço está assim nem por quê; essas perguntas ficam para as demais fontes. Segundo informação preliminar, ainda a confirmar no documento de aquisição, os computadores foram comprados pela Prefeitura em 2022, pouco antes da lei. Nas salas fotografadas não havia nenhum dispositivo, e as crianças se alfabetizam com um alfabeto móvel feito à mão. A política nacional encontra equipamentos de uma iniciativa municipal anterior e lhes atribui nova função. Chamamos essa situação de rugosidade tecnológica, com Santos, para quem a forma permanece aguardando o próximo movimento dinâmico da sociedade.</w:t>
       </w:r>
     </w:p>
     <w:p>
@@ -1399,7 +1433,7 @@
         <w:pStyle w:val="Heading2"/>
       </w:pPr>
       <w:r>
-        <w:t>Lâmina 26 · Tese de partida e formulações</w:t>
+        <w:t>Lâmina 27 · Tese de partida e formulações</w:t>
       </w:r>
     </w:p>
     <w:p>
@@ -1408,7 +1442,7 @@
           <w:color w:val="666666"/>
           <w:sz w:val="20"/>
         </w:rPr>
-        <w:t>85 s  ·  ao final: 23:45</w:t>
+        <w:t>80 s  ·  ao final: 23:45</w:t>
       </w:r>
     </w:p>
     <w:p>
@@ -1425,7 +1459,7 @@
         <w:jc w:val="both"/>
       </w:pPr>
       <w:r>
-        <w:t>Com isso chego à tese de partida. A forma assumida pela PNED no cotidiano escolar resulta da relação entre o que ela prescreve e as condições sob as quais os profissionais precisam atuar. Dessa relação podem surgir adesão, acomodação, adaptação, omissão seletiva, negociação, ressignificação e resistência, e esta última permanece hipótese a examinar nos dados. As condições materiais fazem parte da política; Bowe, Ball e Gold já diziam que as políticas carregam restrições e possibilidades materiais. A tese chega à qualificação com três formulações para confrontar com o campo. Habitar o digital pergunta quem consegue habitar o digital, em que condições e com quais possibilidades de participação. Rugosidade tecnológica nomeia os equipamentos de 2022, anteriores à lei, chamados a cumprir nova função. Vazio material nomeia a exigência curricular com data marcada e meios sem mecanismo federativo obrigatório. As três poderão ser confirmadas, revistas ou abandonadas diante dos dados. A pergunta, assim, vai além da verificação da implementação e indaga o que acontece com uma política de educação digital quando encontra uma escola situada, num território específico, e quem consegue, nessas condições, habitar o digital.</w:t>
+        <w:t>Com isso chego à tese de partida. A forma assumida pela PNED no cotidiano escolar resulta da relação entre o que ela prescreve, o que a rede municipal traduz e as condições sob as quais os profissionais precisam atuar. Dessa relação podem surgir adesão, acomodação, adaptação, omissão seletiva, negociação, ressignificação e resistência, e esta última permanece hipótese a examinar nos dados. As condições materiais fazem parte da política; Bowe, Ball e Gold já diziam que as políticas carregam restrições e possibilidades materiais. A tese chega à qualificação com três formulações para confrontar com o campo. Habitar o digital pergunta quem consegue habitar o digital, em que condições e com quais possibilidades de participação. Rugosidade tecnológica nomeia os equipamentos de 2022, anteriores à lei, chamados a cumprir nova função. Vazio material nomeia a exigência curricular com data marcada e meios sem mecanismo federativo obrigatório. As três poderão ser confirmadas, revistas ou abandonadas diante dos dados.</w:t>
       </w:r>
     </w:p>
     <w:p>
@@ -1433,7 +1467,7 @@
         <w:pStyle w:val="Heading2"/>
       </w:pPr>
       <w:r>
-        <w:t>Lâmina 27 · A questão aberta e os próximos passos</w:t>
+        <w:t>Lâmina 28 · A questão aberta e os próximos passos</w:t>
       </w:r>
     </w:p>
     <w:p>
@@ -1459,7 +1493,7 @@
         <w:jc w:val="both"/>
       </w:pPr>
       <w:r>
-        <w:t>Termino com a questão que atravessa toda a pesquisa. A política fez da educação digital um direito e deixou os meios na dependência de cada ente federado. A pergunta de fundo, que só as narrativas dos profissionais podem responder, é esta: quando a política não faz chegar o equipamento nem a formação, quem paga, no cotidiano escolar, por esse vazio material e formativo? E o que isso significa para os direitos que a lei prometeu às crianças? Para respondê-la, os próximos passos são submeter a emenda ao Comitê de Ética, realizar o campo em dez semanas, completar a análise documental, com os documentos já solicitados à direção da escola e ao técnico da Secretaria, e escrever o capítulo 7, incorporando as contribuições desta banca.</w:t>
+        <w:t>Termino com a questão que atravessa toda a pesquisa. A política fez da educação digital um direito e deixou os meios na dependência de cada ente federado. A pergunta de fundo, que só as narrativas dos profissionais podem responder, é esta: quando a política não faz chegar o equipamento nem a formação, quem paga, no cotidiano escolar, por esse vazio material e formativo? E o que isso significa para os direitos que a lei prometeu às crianças? Para respondê-la, os próximos passos são submeter a emenda ao Comitê de Ética, com a Secretaria como coparticipante, realizar o campo em dez semanas, completar a análise documental, com os documentos já solicitados à direção da escola e ao técnico da Secretaria, e escrever o capítulo 7, incorporando as contribuições desta banca.</w:t>
       </w:r>
     </w:p>
     <w:p>
@@ -1467,7 +1501,7 @@
         <w:pStyle w:val="Heading2"/>
       </w:pPr>
       <w:r>
-        <w:t>Lâmina 28 · Agradecimento</w:t>
+        <w:t>Lâmina 29 · Agradecimento</w:t>
       </w:r>
     </w:p>
     <w:p>
@@ -1500,7 +1534,7 @@
         <w:pStyle w:val="Heading2"/>
       </w:pPr>
       <w:r>
-        <w:t>Lâmina 29 · Referências (1/2)</w:t>
+        <w:t>Lâmina 30 · Referências (1/2)</w:t>
       </w:r>
     </w:p>
     <w:p>
@@ -1526,7 +1560,7 @@
         <w:pStyle w:val="Heading2"/>
       </w:pPr>
       <w:r>
-        <w:t>Lâmina 30 · Referências (2/2)</w:t>
+        <w:t>Lâmina 31 · Referências (2/2)</w:t>
       </w:r>
     </w:p>
     <w:p>
@@ -1577,10 +1611,10 @@
         <w:rPr>
           <w:b/>
         </w:rPr>
-        <w:t xml:space="preserve">Lâmina 15 (território e habitar): </w:t>
+        <w:t xml:space="preserve">Lâmina 14 (contexto da prática): </w:t>
       </w:r>
       <w:r>
-        <w:t>omitir a frase sobre plataformas e dados. Ganho de cerca de 20 s.</w:t>
+        <w:t>dizer apenas a primeira frase de cada noção. Ganho de cerca de 30 s.</w:t>
       </w:r>
     </w:p>
     <w:p>
@@ -1605,10 +1639,10 @@
         <w:rPr>
           <w:b/>
         </w:rPr>
-        <w:t xml:space="preserve">Lâmina 17 (desenho e participantes): </w:t>
+        <w:t xml:space="preserve">Lâmina 24 (Tibau do Sul): </w:t>
       </w:r>
       <w:r>
-        <w:t>dizer "24 profissionais e um técnico da Secretaria", sem listar as funções. Ganho de cerca de 15 s.</w:t>
+        <w:t>dizer só as localidades e a pergunta final. Ganho de cerca de 20 s.</w:t>
       </w:r>
     </w:p>
     <w:p>
@@ -1630,7 +1664,35 @@
         <w:t xml:space="preserve">Proximidade com a rede: </w:t>
       </w:r>
       <w:r>
-        <w:t>a pesquisadora trabalha na rede municipal; os cuidados são o confronto entre fontes, a devolutiva individual e o diário de campo, com a reflexividade pedida por Braun e Clarke.</w:t>
+        <w:t>a pesquisadora trabalha na rede municipal e entrevistará um técnico da mesma administração; os cuidados são o confronto entre fontes, a devolutiva individual e o diário de campo, com a reflexividade pedida por Braun e Clarke.</w:t>
+      </w:r>
+    </w:p>
+    <w:p>
+      <w:pPr>
+        <w:pStyle w:val="ListBullet"/>
+      </w:pPr>
+      <w:r>
+        <w:rPr>
+          <w:b/>
+        </w:rPr>
+        <w:t xml:space="preserve">Por que só uma escola: </w:t>
+      </w:r>
+      <w:r>
+        <w:t>é um caso único com unidades incorporadas: a rede entra pelos documentos, pelos dados do Censo Escolar e pelo técnico da Secretaria; as outras escolas não são ouvidas, limite declarado no capítulo 4.</w:t>
+      </w:r>
+    </w:p>
+    <w:p>
+      <w:pPr>
+        <w:pStyle w:val="ListBullet"/>
+      </w:pPr>
+      <w:r>
+        <w:rPr>
+          <w:b/>
+        </w:rPr>
+        <w:t xml:space="preserve">Por que só o técnico na SME: </w:t>
+      </w:r>
+      <w:r>
+        <w:t>é quem acompanha os programas e as orientações às escolas e informou a existência do plano da rede; a escolha foi feita com a orientadora.</w:t>
       </w:r>
     </w:p>
     <w:p>

</xml_diff>

<commit_message>
Reduz a apresentação a 20 lâminas de conteúdo e atualiza o roteiro de fala
Retira a linha do tempo (incorporada ao ineditismo), funde Pipa e a
escola numa lâmina, traz o caso dos computadores de Sibaúma (Silva,
2011) para a lâmina de Tibau do Sul e ajusta as referências; roteiro
de 25 minutos refeito para 29 lâminas.

Co-Authored-By: Claude Opus 5.5 <noreply@anthropic.com>
Claude-Session: https://claude.ai/code/session_01HxStpW4pQoDfJdTDYr6zEC
</commit_message>
<xml_diff>
--- a/apresentacao_qualificacao/ROTEIRO_DE_FALA_25min.docx
+++ b/apresentacao_qualificacao/ROTEIRO_DE_FALA_25min.docx
@@ -28,7 +28,7 @@
       <w:r>
         <w:t>Yzynya Silva Rezende Machado · Orientadora: Profa. Dra. Maria Cristina Leandro de Paiva</w:t>
         <w:br/>
-        <w:t>Apresentação: Qualificacao_PNED_Pipa.pptx (31 lâminas, das quais as duas últimas são de referências) · Duração prevista: 25 minutos</w:t>
+        <w:t>Apresentação: Qualificacao_PNED_Pipa.pptx (29 lâminas, das quais as duas últimas são de referências) · Duração prevista: 25 minutos</w:t>
       </w:r>
     </w:p>
     <w:p>
@@ -44,7 +44,7 @@
         <w:pStyle w:val="ListBullet"/>
       </w:pPr>
       <w:r>
-        <w:t>O texto tem 2961 palavras, o que dá cerca de 24 minutos de fala a 125 palavras por minuto, ritmo pausado. Os 1 minutos restantes ficam para as trocas de lâmina, as pausas e o tempo de apontar fotos e mapa. Se o ensaio cronometrado der mais de 26 minutos, use os cortes sugeridos no fim do documento.</w:t>
+        <w:t>O texto tem 2796 palavras, o que dá cerca de 22 minutos de fala a 125 palavras por minuto, ritmo pausado. Os 3 minutos restantes ficam para as trocas de lâmina, as pausas e o tempo de apontar fotos e mapa. Se o ensaio cronometrado der mais de 26 minutos, use os cortes sugeridos no fim do documento.</w:t>
       </w:r>
     </w:p>
     <w:p>
@@ -52,7 +52,7 @@
         <w:pStyle w:val="ListBullet"/>
       </w:pPr>
       <w:r>
-        <w:t>Cada lâmina traz o tempo previsto e o tempo acumulado ao final dela. Os três pontos de controle mais úteis são: fim da lâmina 11 por volta de 09:40, fim da lâmina 18 por volta de 16:00 e fim da lâmina 26 por volta de 22:25.</w:t>
+        <w:t>Cada lâmina traz o tempo previsto e o tempo acumulado ao final dela. Os três pontos de controle mais úteis são: fim da lâmina 10 por volta de 09:25, fim da lâmina 18 por volta de 16:00 e fim da lâmina 24 por volta de 22:05.</w:t>
       </w:r>
     </w:p>
     <w:p>
@@ -212,7 +212,7 @@
           </w:tcPr>
           <w:p>
             <w:r>
-              <w:t>3-8</w:t>
+              <w:t>3-7</w:t>
             </w:r>
           </w:p>
         </w:tc>
@@ -222,7 +222,7 @@
           </w:tcPr>
           <w:p>
             <w:r>
-              <w:t>06:25</w:t>
+              <w:t>06:00</w:t>
             </w:r>
           </w:p>
         </w:tc>
@@ -232,7 +232,7 @@
           </w:tcPr>
           <w:p>
             <w:r>
-              <w:t>07:20</w:t>
+              <w:t>06:55</w:t>
             </w:r>
           </w:p>
         </w:tc>
@@ -254,7 +254,7 @@
           </w:tcPr>
           <w:p>
             <w:r>
-              <w:t>9-11</w:t>
+              <w:t>8-10</w:t>
             </w:r>
           </w:p>
         </w:tc>
@@ -264,7 +264,7 @@
           </w:tcPr>
           <w:p>
             <w:r>
-              <w:t>02:20</w:t>
+              <w:t>02:30</w:t>
             </w:r>
           </w:p>
         </w:tc>
@@ -274,7 +274,7 @@
           </w:tcPr>
           <w:p>
             <w:r>
-              <w:t>09:40</w:t>
+              <w:t>09:25</w:t>
             </w:r>
           </w:p>
         </w:tc>
@@ -296,7 +296,7 @@
           </w:tcPr>
           <w:p>
             <w:r>
-              <w:t>12-15</w:t>
+              <w:t>11-14</w:t>
             </w:r>
           </w:p>
         </w:tc>
@@ -306,7 +306,7 @@
           </w:tcPr>
           <w:p>
             <w:r>
-              <w:t>04:10</w:t>
+              <w:t>04:15</w:t>
             </w:r>
           </w:p>
         </w:tc>
@@ -316,7 +316,7 @@
           </w:tcPr>
           <w:p>
             <w:r>
-              <w:t>13:50</w:t>
+              <w:t>13:40</w:t>
             </w:r>
           </w:p>
         </w:tc>
@@ -338,7 +338,7 @@
           </w:tcPr>
           <w:p>
             <w:r>
-              <w:t>16-18</w:t>
+              <w:t>15-17</w:t>
             </w:r>
           </w:p>
         </w:tc>
@@ -358,7 +358,7 @@
           </w:tcPr>
           <w:p>
             <w:r>
-              <w:t>16:00</w:t>
+              <w:t>15:50</w:t>
             </w:r>
           </w:p>
         </w:tc>
@@ -380,7 +380,7 @@
           </w:tcPr>
           <w:p>
             <w:r>
-              <w:t>19-22</w:t>
+              <w:t>18-21</w:t>
             </w:r>
           </w:p>
         </w:tc>
@@ -390,7 +390,7 @@
           </w:tcPr>
           <w:p>
             <w:r>
-              <w:t>03:30</w:t>
+              <w:t>03:40</w:t>
             </w:r>
           </w:p>
         </w:tc>
@@ -422,7 +422,7 @@
           </w:tcPr>
           <w:p>
             <w:r>
-              <w:t>23-26</w:t>
+              <w:t>22-24</w:t>
             </w:r>
           </w:p>
         </w:tc>
@@ -432,7 +432,7 @@
           </w:tcPr>
           <w:p>
             <w:r>
-              <w:t>02:55</w:t>
+              <w:t>02:35</w:t>
             </w:r>
           </w:p>
         </w:tc>
@@ -442,7 +442,7 @@
           </w:tcPr>
           <w:p>
             <w:r>
-              <w:t>22:25</w:t>
+              <w:t>22:05</w:t>
             </w:r>
           </w:p>
         </w:tc>
@@ -464,7 +464,7 @@
           </w:tcPr>
           <w:p>
             <w:r>
-              <w:t>27-29</w:t>
+              <w:t>25-27</w:t>
             </w:r>
           </w:p>
         </w:tc>
@@ -474,7 +474,7 @@
           </w:tcPr>
           <w:p>
             <w:r>
-              <w:t>02:35</w:t>
+              <w:t>02:55</w:t>
             </w:r>
           </w:p>
         </w:tc>
@@ -506,7 +506,7 @@
           </w:tcPr>
           <w:p>
             <w:r>
-              <w:t>30-31</w:t>
+              <w:t>28-29</w:t>
             </w:r>
           </w:p>
         </w:tc>
@@ -556,7 +556,7 @@
               <w:rPr>
                 <w:b/>
               </w:rPr>
-              <w:t>1-31</w:t>
+              <w:t>1-29</w:t>
             </w:r>
           </w:p>
         </w:tc>
@@ -754,7 +754,7 @@
           <w:color w:val="666666"/>
           <w:sz w:val="20"/>
         </w:rPr>
-        <w:t>95 s  ·  ao final: 04:45</w:t>
+        <w:t>105 s  ·  ao final: 04:55</w:t>
       </w:r>
     </w:p>
     <w:p>
@@ -779,7 +779,7 @@
         <w:pStyle w:val="Heading2"/>
       </w:pPr>
       <w:r>
-        <w:t>Lâmina 6 · Por que agora?</w:t>
+        <w:t>Lâmina 6 · Relevâncias da pesquisa</w:t>
       </w:r>
     </w:p>
     <w:p>
@@ -788,41 +788,7 @@
           <w:color w:val="666666"/>
           <w:sz w:val="20"/>
         </w:rPr>
-        <w:t>50 s  ·  ao final: 05:35</w:t>
-      </w:r>
-    </w:p>
-    <w:p>
-      <w:r>
-        <w:rPr>
-          <w:i/>
-          <w:color w:val="555555"/>
-        </w:rPr>
-        <w:t>[Percorrer os cartões da esquerda para a direita e terminar no cartão claro, "2026".]</w:t>
-      </w:r>
-    </w:p>
-    <w:p>
-      <w:pPr>
-        <w:jc w:val="both"/>
-      </w:pPr>
-      <w:r>
-        <w:t>Por que pesquisar isso agora? A linha do tempo responde. Em janeiro de 2023, a lei institui a PNED. Em dezembro, com a derrubada do veto, a educação digital passa a ser componente curricular do ensino fundamental. Em março de 2025, a Resolução CNE/CEB nº 2 prevê a implementação curricular a partir de 2026. Em março de 2026 entra em vigor o Estatuto Digital da Criança e do Adolescente, e em abril é aprovado o novo Plano Nacional de Educação. A pesquisa acontece quando essas normas começam a chegar juntas às escolas. Como lembram Bowe, Ball e Gold, no contexto da prática a política está sujeita à interpretação e é recriada.</w:t>
-      </w:r>
-    </w:p>
-    <w:p>
-      <w:pPr>
-        <w:pStyle w:val="Heading2"/>
-      </w:pPr>
-      <w:r>
-        <w:t>Lâmina 7 · Relevâncias da pesquisa</w:t>
-      </w:r>
-    </w:p>
-    <w:p>
-      <w:r>
-        <w:rPr>
-          <w:color w:val="666666"/>
-          <w:sz w:val="20"/>
-        </w:rPr>
-        <w:t>60 s  ·  ao final: 06:35</w:t>
+        <w:t>60 s  ·  ao final: 05:55</w:t>
       </w:r>
     </w:p>
     <w:p>
@@ -838,7 +804,7 @@
         <w:pStyle w:val="Heading2"/>
       </w:pPr>
       <w:r>
-        <w:t>Lâmina 8 · Ineditismo</w:t>
+        <w:t>Lâmina 7 · Ineditismo</w:t>
       </w:r>
     </w:p>
     <w:p>
@@ -847,7 +813,7 @@
           <w:color w:val="666666"/>
           <w:sz w:val="20"/>
         </w:rPr>
-        <w:t>45 s  ·  ao final: 07:20</w:t>
+        <w:t>60 s  ·  ao final: 06:55</w:t>
       </w:r>
     </w:p>
     <w:p>
@@ -855,7 +821,7 @@
         <w:jc w:val="both"/>
       </w:pPr>
       <w:r>
-        <w:t>O ineditismo aparece em três planos. No empírico-temporal, acompanhamos a chegada da PNED da Secretaria à escola enquanto ela acontece: nenhum dos nove estudos da revisão examina essa política ou uma rede municipal de pequeno porte. No analítico-espacial, o território municipal, de Tibau do Sul a Pipa, entra como parte do contexto, lido com Milton Santos e com Doreen Massey. No teórico-conceitual, articulamos atuação, culturas profissionais, materialidade e território, e daí nasce a formulação habitar o digital.</w:t>
+        <w:t>O ineditismo aparece em três planos. No empírico-temporal, acompanhamos a chegada da PNED da Secretaria à escola enquanto ela acontece: a lei é de 2023, a educação digital virou componente curricular no fim daquele ano e a Resolução CNE/CEB nº 2, de 2025, marcou a implementação para 2026, e nenhum dos nove estudos da revisão examina essa política ou uma rede municipal de pequeno porte. No analítico-espacial, o território municipal, de Tibau do Sul a Pipa, entra como parte do contexto, lido com Milton Santos e com Doreen Massey. No teórico-conceitual, articulamos atuação, culturas profissionais, materialidade e território, e daí nasce a formulação habitar o digital.</w:t>
       </w:r>
     </w:p>
     <w:p>
@@ -871,7 +837,7 @@
         <w:pStyle w:val="Heading2"/>
       </w:pPr>
       <w:r>
-        <w:t>Lâmina 9 · Divisor: Revisão sistemática</w:t>
+        <w:t>Lâmina 8 · Divisor: Revisão sistemática</w:t>
       </w:r>
     </w:p>
     <w:p>
@@ -880,7 +846,7 @@
           <w:color w:val="666666"/>
           <w:sz w:val="20"/>
         </w:rPr>
-        <w:t>10 s  ·  ao final: 07:30</w:t>
+        <w:t>10 s  ·  ao final: 07:05</w:t>
       </w:r>
     </w:p>
     <w:p>
@@ -896,7 +862,7 @@
         <w:pStyle w:val="Heading2"/>
       </w:pPr>
       <w:r>
-        <w:t>Lâmina 10 · Percurso e respostas da revisão</w:t>
+        <w:t>Lâmina 9 · Percurso e respostas da revisão</w:t>
       </w:r>
     </w:p>
     <w:p>
@@ -905,7 +871,7 @@
           <w:color w:val="666666"/>
           <w:sz w:val="20"/>
         </w:rPr>
-        <w:t>50 s  ·  ao final: 08:20</w:t>
+        <w:t>60 s  ·  ao final: 08:05</w:t>
       </w:r>
     </w:p>
     <w:p>
@@ -921,7 +887,7 @@
         <w:pStyle w:val="Heading2"/>
       </w:pPr>
       <w:r>
-        <w:t>Lâmina 11 · O que a revisão decidiu</w:t>
+        <w:t>Lâmina 10 · O que a revisão decidiu</w:t>
       </w:r>
     </w:p>
     <w:p>
@@ -930,7 +896,7 @@
           <w:color w:val="666666"/>
           <w:sz w:val="20"/>
         </w:rPr>
-        <w:t>80 s  ·  ao final: 09:40</w:t>
+        <w:t>80 s  ·  ao final: 09:25</w:t>
       </w:r>
     </w:p>
     <w:p>
@@ -963,7 +929,7 @@
         <w:pStyle w:val="Heading2"/>
       </w:pPr>
       <w:r>
-        <w:t>Lâmina 12 · Divisor: Fundamentos teóricos</w:t>
+        <w:t>Lâmina 11 · Divisor: Fundamentos teóricos</w:t>
       </w:r>
     </w:p>
     <w:p>
@@ -972,7 +938,7 @@
           <w:color w:val="666666"/>
           <w:sz w:val="20"/>
         </w:rPr>
-        <w:t>10 s  ·  ao final: 09:50</w:t>
+        <w:t>10 s  ·  ao final: 09:35</w:t>
       </w:r>
     </w:p>
     <w:p>
@@ -988,7 +954,7 @@
         <w:pStyle w:val="Heading2"/>
       </w:pPr>
       <w:r>
-        <w:t>Lâmina 13 · Do texto ao ato</w:t>
+        <w:t>Lâmina 12 · Do texto ao ato</w:t>
       </w:r>
     </w:p>
     <w:p>
@@ -997,7 +963,7 @@
           <w:color w:val="666666"/>
           <w:sz w:val="20"/>
         </w:rPr>
-        <w:t>80 s  ·  ao final: 11:10</w:t>
+        <w:t>85 s  ·  ao final: 11:00</w:t>
       </w:r>
     </w:p>
     <w:p>
@@ -1022,7 +988,7 @@
         <w:pStyle w:val="Heading2"/>
       </w:pPr>
       <w:r>
-        <w:t>Lâmina 14 · No contexto da prática</w:t>
+        <w:t>Lâmina 13 · No contexto da prática</w:t>
       </w:r>
     </w:p>
     <w:p>
@@ -1031,7 +997,7 @@
           <w:color w:val="666666"/>
           <w:sz w:val="20"/>
         </w:rPr>
-        <w:t>80 s  ·  ao final: 12:30</w:t>
+        <w:t>80 s  ·  ao final: 12:20</w:t>
       </w:r>
     </w:p>
     <w:p>
@@ -1047,7 +1013,7 @@
         <w:pStyle w:val="Heading2"/>
       </w:pPr>
       <w:r>
-        <w:t>Lâmina 15 · Onde a política é posta em ato</w:t>
+        <w:t>Lâmina 14 · Onde a política é posta em ato</w:t>
       </w:r>
     </w:p>
     <w:p>
@@ -1056,7 +1022,7 @@
           <w:color w:val="666666"/>
           <w:sz w:val="20"/>
         </w:rPr>
-        <w:t>80 s  ·  ao final: 13:50</w:t>
+        <w:t>80 s  ·  ao final: 13:40</w:t>
       </w:r>
     </w:p>
     <w:p>
@@ -1089,7 +1055,7 @@
         <w:pStyle w:val="Heading2"/>
       </w:pPr>
       <w:r>
-        <w:t>Lâmina 16 · Divisor: Metodologia</w:t>
+        <w:t>Lâmina 15 · Divisor: Metodologia</w:t>
       </w:r>
     </w:p>
     <w:p>
@@ -1098,7 +1064,7 @@
           <w:color w:val="666666"/>
           <w:sz w:val="20"/>
         </w:rPr>
-        <w:t>10 s  ·  ao final: 14:00</w:t>
+        <w:t>10 s  ·  ao final: 13:50</w:t>
       </w:r>
     </w:p>
     <w:p>
@@ -1114,7 +1080,7 @@
         <w:pStyle w:val="Heading2"/>
       </w:pPr>
       <w:r>
-        <w:t>Lâmina 17 · Desenho e participantes</w:t>
+        <w:t>Lâmina 16 · Desenho e participantes</w:t>
       </w:r>
     </w:p>
     <w:p>
@@ -1123,7 +1089,7 @@
           <w:color w:val="666666"/>
           <w:sz w:val="20"/>
         </w:rPr>
-        <w:t>60 s  ·  ao final: 15:00</w:t>
+        <w:t>60 s  ·  ao final: 14:50</w:t>
       </w:r>
     </w:p>
     <w:p>
@@ -1139,7 +1105,7 @@
         <w:pStyle w:val="Heading2"/>
       </w:pPr>
       <w:r>
-        <w:t>Lâmina 18 · Construção dos dados</w:t>
+        <w:t>Lâmina 17 · Construção dos dados</w:t>
       </w:r>
     </w:p>
     <w:p>
@@ -1148,7 +1114,7 @@
           <w:color w:val="666666"/>
           <w:sz w:val="20"/>
         </w:rPr>
-        <w:t>60 s  ·  ao final: 16:00</w:t>
+        <w:t>60 s  ·  ao final: 15:50</w:t>
       </w:r>
     </w:p>
     <w:p>
@@ -1172,7 +1138,7 @@
         <w:pStyle w:val="Heading2"/>
       </w:pPr>
       <w:r>
-        <w:t>Lâmina 19 · Divisor: Agenda global e PNED</w:t>
+        <w:t>Lâmina 18 · Divisor: Agenda global e PNED</w:t>
       </w:r>
     </w:p>
     <w:p>
@@ -1181,7 +1147,7 @@
           <w:color w:val="666666"/>
           <w:sz w:val="20"/>
         </w:rPr>
-        <w:t>10 s  ·  ao final: 16:10</w:t>
+        <w:t>10 s  ·  ao final: 16:00</w:t>
       </w:r>
     </w:p>
     <w:p>
@@ -1197,7 +1163,7 @@
         <w:pStyle w:val="Heading2"/>
       </w:pPr>
       <w:r>
-        <w:t>Lâmina 20 · O que outros territórios nos ensinam</w:t>
+        <w:t>Lâmina 19 · O que outros territórios nos ensinam</w:t>
       </w:r>
     </w:p>
     <w:p>
@@ -1206,7 +1172,7 @@
           <w:color w:val="666666"/>
           <w:sz w:val="20"/>
         </w:rPr>
-        <w:t>65 s  ·  ao final: 17:15</w:t>
+        <w:t>65 s  ·  ao final: 17:05</w:t>
       </w:r>
     </w:p>
     <w:p>
@@ -1231,7 +1197,7 @@
         <w:pStyle w:val="Heading2"/>
       </w:pPr>
       <w:r>
-        <w:t>Lâmina 21 · O que a comparação traz para a tese</w:t>
+        <w:t>Lâmina 20 · O que a comparação traz para a tese</w:t>
       </w:r>
     </w:p>
     <w:p>
@@ -1240,7 +1206,7 @@
           <w:color w:val="666666"/>
           <w:sz w:val="20"/>
         </w:rPr>
-        <w:t>65 s  ·  ao final: 18:20</w:t>
+        <w:t>70 s  ·  ao final: 18:15</w:t>
       </w:r>
     </w:p>
     <w:p>
@@ -1265,7 +1231,7 @@
         <w:pStyle w:val="Heading2"/>
       </w:pPr>
       <w:r>
-        <w:t>Lâmina 22 · A PNED e o vazio material</w:t>
+        <w:t>Lâmina 21 · A PNED e o vazio material</w:t>
       </w:r>
     </w:p>
     <w:p>
@@ -1274,7 +1240,7 @@
           <w:color w:val="666666"/>
           <w:sz w:val="20"/>
         </w:rPr>
-        <w:t>70 s  ·  ao final: 19:30</w:t>
+        <w:t>75 s  ·  ao final: 19:30</w:t>
       </w:r>
     </w:p>
     <w:p>
@@ -1307,7 +1273,7 @@
         <w:pStyle w:val="Heading2"/>
       </w:pPr>
       <w:r>
-        <w:t>Lâmina 23 · Divisor: Do município à escola</w:t>
+        <w:t>Lâmina 22 · Divisor: Do município à escola</w:t>
       </w:r>
     </w:p>
     <w:p>
@@ -1332,7 +1298,7 @@
         <w:pStyle w:val="Heading2"/>
       </w:pPr>
       <w:r>
-        <w:t>Lâmina 24 · Tibau do Sul</w:t>
+        <w:t>Lâmina 23 · Tibau do Sul</w:t>
       </w:r>
     </w:p>
     <w:p>
@@ -1341,7 +1307,7 @@
           <w:color w:val="666666"/>
           <w:sz w:val="20"/>
         </w:rPr>
-        <w:t>55 s  ·  ao final: 20:35</w:t>
+        <w:t>70 s  ·  ao final: 20:50</w:t>
       </w:r>
     </w:p>
     <w:p>
@@ -1358,7 +1324,7 @@
         <w:jc w:val="both"/>
       </w:pPr>
       <w:r>
-        <w:t>Tibau do Sul tem 102 quilômetros quadrados e tinha 16.929 habitantes no Censo de 2022; em 2010, cerca de 40% da população vivia em área rural, dado que ainda vou conferir. O IBGE reconhece só o distrito sede, mas o município se organiza em localidades muito diferentes: a sede, Pipa, Piau, os povoados rurais e Sibaúma, comunidade quilombola certificada pela Fundação Palmares em 2005. A rede tem escolas nesses lugares. Segundo o técnico da Secretaria, há um plano elaborado para a rede como um todo. A pergunta é se a tradução municipal da PNED considera essas diferenças.</w:t>
+        <w:t>Tibau do Sul tem 102 quilômetros quadrados e tinha 16.929 habitantes no Censo de 2022; em 2010, cerca de 40% da população vivia em área rural, dado que ainda vou conferir. O IBGE reconhece só o distrito sede, mas o município se organiza em localidades muito diferentes: a sede, Pipa, Piau, os povoados rurais e Sibaúma, comunidade quilombola certificada pela Fundação Palmares em 2005. A rede tem escolas nesses lugares, e a história delas importa: em Sibaúma, entre 2007 e 2009, a escola recebeu dois computadores que estragaram sem manutenção, e a internet foi desativada, como registra Silva. Segundo o técnico da Secretaria, há um plano elaborado para a rede como um todo. A pergunta é se a tradução municipal da PNED considera essas diferenças.</w:t>
       </w:r>
     </w:p>
     <w:p>
@@ -1366,7 +1332,7 @@
         <w:pStyle w:val="Heading2"/>
       </w:pPr>
       <w:r>
-        <w:t>Lâmina 25 · Pipa</w:t>
+        <w:t>Lâmina 24 · Pipa e a escola</w:t>
       </w:r>
     </w:p>
     <w:p>
@@ -1375,7 +1341,7 @@
           <w:color w:val="666666"/>
           <w:sz w:val="20"/>
         </w:rPr>
-        <w:t>55 s  ·  ao final: 21:30</w:t>
+        <w:t>75 s  ·  ao final: 22:05</w:t>
       </w:r>
     </w:p>
     <w:p>
@@ -1392,32 +1358,7 @@
         <w:jc w:val="both"/>
       </w:pPr>
       <w:r>
-        <w:t>Nos anos 1970, Pipa era uma comunidade agrícola e pesqueira, sem energia elétrica, água encanada e boas vias de acesso. A partir de meados daquela década chegaram os surfistas, e a divulgação mais intensa nos anos 1990 trouxe turistas de várias partes do mundo, como reconstitui Aires. As fotografias mostram essa passagem: a construção artesanal de uma embarcação, um grupo de surfistas em abril de 1991 e a vista aérea atual, com pousadas e restaurantes que se vendem pela internet. Aires observa que a população nativa não foi passiva e que muitas paisagens ainda revelam materialidades de tempos passados, o que aproxima a história da localidade da noção de rugosidade. Massey nos impede de ler a distância entre escola e polo turístico como atraso: os dois são contemporâneos.</w:t>
-      </w:r>
-    </w:p>
-    <w:p>
-      <w:pPr>
-        <w:pStyle w:val="Heading2"/>
-      </w:pPr>
-      <w:r>
-        <w:t>Lâmina 26 · A escola</w:t>
-      </w:r>
-    </w:p>
-    <w:p>
-      <w:r>
-        <w:rPr>
-          <w:color w:val="666666"/>
-          <w:sz w:val="20"/>
-        </w:rPr>
-        <w:t>55 s  ·  ao final: 22:25</w:t>
-      </w:r>
-    </w:p>
-    <w:p>
-      <w:pPr>
-        <w:jc w:val="both"/>
-      </w:pPr>
-      <w:r>
-        <w:t>Na escola, o laboratório de informática foi fotografado com os equipamentos desligados. A imagem não diz há quanto tempo o espaço está assim nem por quê; essas perguntas ficam para as demais fontes. Segundo informação preliminar, ainda a confirmar no documento de aquisição, os computadores foram comprados pela Prefeitura em 2022, pouco antes da lei. Nas salas fotografadas não havia nenhum dispositivo, e as crianças se alfabetizam com um alfabeto móvel feito à mão. A política nacional encontra equipamentos de uma iniciativa municipal anterior e lhes atribui nova função. Chamamos essa situação de rugosidade tecnológica, com Santos, para quem a forma permanece aguardando o próximo movimento dinâmico da sociedade.</w:t>
+        <w:t>Em Pipa, a vila de pescadores recebeu surfistas a partir dos anos 1970 e o turismo internacional nos anos 1990, como mostram Aires e Alves. Hoje, pousadas, restaurantes e passeios se vendem pela internet. Na escola, o laboratório de informática foi fotografado com os equipamentos desligados, e nas salas não havia nenhum dispositivo; as crianças se alfabetizam com um alfabeto móvel feito à mão. Segundo informação preliminar, os computadores foram comprados pela Prefeitura em 2022. Chamamos essa situação de rugosidade tecnológica, com Santos: a forma permanece aguardando o próximo movimento dinâmico da sociedade. O caso de Sibaúma sugere que essa história pode se repetir na rede. Massey nos impede de ler a distância entre a escola e o polo turístico como atraso: os dois são contemporâneos.</w:t>
       </w:r>
     </w:p>
     <w:p>
@@ -1433,7 +1374,7 @@
         <w:pStyle w:val="Heading2"/>
       </w:pPr>
       <w:r>
-        <w:t>Lâmina 27 · Tese de partida e formulações</w:t>
+        <w:t>Lâmina 25 · Tese de partida e formulações</w:t>
       </w:r>
     </w:p>
     <w:p>
@@ -1442,7 +1383,7 @@
           <w:color w:val="666666"/>
           <w:sz w:val="20"/>
         </w:rPr>
-        <w:t>80 s  ·  ao final: 23:45</w:t>
+        <w:t>90 s  ·  ao final: 23:35</w:t>
       </w:r>
     </w:p>
     <w:p>
@@ -1467,7 +1408,7 @@
         <w:pStyle w:val="Heading2"/>
       </w:pPr>
       <w:r>
-        <w:t>Lâmina 28 · A questão aberta e os próximos passos</w:t>
+        <w:t>Lâmina 26 · A questão aberta e os próximos passos</w:t>
       </w:r>
     </w:p>
     <w:p>
@@ -1476,7 +1417,7 @@
           <w:color w:val="666666"/>
           <w:sz w:val="20"/>
         </w:rPr>
-        <w:t>60 s  ·  ao final: 24:45</w:t>
+        <w:t>70 s  ·  ao final: 24:45</w:t>
       </w:r>
     </w:p>
     <w:p>
@@ -1501,7 +1442,7 @@
         <w:pStyle w:val="Heading2"/>
       </w:pPr>
       <w:r>
-        <w:t>Lâmina 29 · Agradecimento</w:t>
+        <w:t>Lâmina 27 · Agradecimento</w:t>
       </w:r>
     </w:p>
     <w:p>
@@ -1534,7 +1475,7 @@
         <w:pStyle w:val="Heading2"/>
       </w:pPr>
       <w:r>
-        <w:t>Lâmina 30 · Referências (1/2)</w:t>
+        <w:t>Lâmina 28 · Referências (1/2)</w:t>
       </w:r>
     </w:p>
     <w:p>
@@ -1560,7 +1501,7 @@
         <w:pStyle w:val="Heading2"/>
       </w:pPr>
       <w:r>
-        <w:t>Lâmina 31 · Referências (2/2)</w:t>
+        <w:t>Lâmina 29 · Referências (2/2)</w:t>
       </w:r>
     </w:p>
     <w:p>
@@ -1597,7 +1538,7 @@
         <w:rPr>
           <w:b/>
         </w:rPr>
-        <w:t xml:space="preserve">Lâmina 20 (mapa): </w:t>
+        <w:t xml:space="preserve">Lâmina 19 (mapa): </w:t>
       </w:r>
       <w:r>
         <w:t>dizer só a primeira e a terceira frases e apontar o mapa, sem citar os países. Ganho de cerca de 40 s.</w:t>
@@ -1611,7 +1552,7 @@
         <w:rPr>
           <w:b/>
         </w:rPr>
-        <w:t xml:space="preserve">Lâmina 14 (contexto da prática): </w:t>
+        <w:t xml:space="preserve">Lâmina 13 (contexto da prática): </w:t>
       </w:r>
       <w:r>
         <w:t>dizer apenas a primeira frase de cada noção. Ganho de cerca de 30 s.</w:t>
@@ -1625,7 +1566,7 @@
         <w:rPr>
           <w:b/>
         </w:rPr>
-        <w:t xml:space="preserve">Lâmina 21 (comparação): </w:t>
+        <w:t xml:space="preserve">Lâmina 20 (comparação): </w:t>
       </w:r>
       <w:r>
         <w:t>nomear as cinco categorias e ler apenas a pergunta final. Ganho de cerca de 30 s.</w:t>
@@ -1639,7 +1580,7 @@
         <w:rPr>
           <w:b/>
         </w:rPr>
-        <w:t xml:space="preserve">Lâmina 24 (Tibau do Sul): </w:t>
+        <w:t xml:space="preserve">Lâmina 23 (Tibau do Sul): </w:t>
       </w:r>
       <w:r>
         <w:t>dizer só as localidades e a pergunta final. Ganho de cerca de 20 s.</w:t>

</xml_diff>

<commit_message>
Recoloca Pipa como foco da apresentação e do roteiro de fala
O caso é a escola de Pipa; o território municipal e a SME passam a ser
o percurso em funil até ela. Ajusta objeto, objetivo (a), relevâncias,
ineditismo, decisões da RSL, desenho e a lâmina de Tibau do Sul.

Co-Authored-By: Claude Opus 5.5 <noreply@anthropic.com>
Claude-Session: https://claude.ai/code/session_01HxStpW4pQoDfJdTDYr6zEC
</commit_message>
<xml_diff>
--- a/apresentacao_qualificacao/ROTEIRO_DE_FALA_25min.docx
+++ b/apresentacao_qualificacao/ROTEIRO_DE_FALA_25min.docx
@@ -44,7 +44,7 @@
         <w:pStyle w:val="ListBullet"/>
       </w:pPr>
       <w:r>
-        <w:t>O texto tem 2796 palavras, o que dá cerca de 22 minutos de fala a 125 palavras por minuto, ritmo pausado. Os 3 minutos restantes ficam para as trocas de lâmina, as pausas e o tempo de apontar fotos e mapa. Se o ensaio cronometrado der mais de 26 minutos, use os cortes sugeridos no fim do documento.</w:t>
+        <w:t>O texto tem 2817 palavras, o que dá cerca de 23 minutos de fala a 125 palavras por minuto, ritmo pausado. Os 2 minutos restantes ficam para as trocas de lâmina, as pausas e o tempo de apontar fotos e mapa. Se o ensaio cronometrado der mais de 26 minutos, use os cortes sugeridos no fim do documento.</w:t>
       </w:r>
     </w:p>
     <w:p>
@@ -703,7 +703,7 @@
         <w:jc w:val="both"/>
       </w:pPr>
       <w:r>
-        <w:t>O objeto desta tese é a Política Nacional de Educação Digital, instituída pela Lei nº 14.533, de 2023, no eixo que chega às escolas, a Educação Digital Escolar. Acompanho essa política em forma de funil. Ela começa na Secretaria Municipal de Educação de Tibau do Sul, que a recebe e a traduz para uma rede de escolas situadas em localidades muito diferentes, e chega à Escola Municipal Domitila Castelo da Silva, em Pipa. Ali, os profissionais da educação dos anos iniciais a interpretam, traduzem e recontextualizam: professoras e professores, coordenação, direção e apoio pedagógico. Trabalho com a ideia de Ball, Maguire e Braun de que as atuações são coletivas, criativas e limitadas.</w:t>
+        <w:t>O objeto desta tese é a encenação da Política Nacional de Educação Digital, instituída pela Lei nº 14.533, de 2023, no eixo Educação Digital Escolar, na Escola Municipal Domitila Castelo da Silva, em Pipa. O foco está nos profissionais dos anos iniciais, do 1º ao 5º ano: professoras e professores, coordenação, direção e apoio pedagógico. Para chegar a Pipa, a pesquisa percorre um caminho em funil. Parte do território municipal de Tibau do Sul e dos documentos da Secretaria Municipal de Educação e pergunta se eles consideram a realidade diversa de cada localidade, até chegar à escola. Trabalho com a ideia de Ball, Maguire e Braun de que as atuações são coletivas, criativas e limitadas.</w:t>
       </w:r>
     </w:p>
     <w:p>
@@ -763,7 +763,7 @@
           <w:i/>
           <w:color w:val="555555"/>
         </w:rPr>
-        <w:t>[Cada cartão tem um rótulo: rede municipal, interpretação, condições e território, formas de atuação e crianças. Destacar os verbos: analisar, compreender, examinar, identificar.]</w:t>
+        <w:t>[Cada cartão tem um rótulo: do município a Pipa, interpretação, condições e território, formas de atuação e crianças. Destacar os verbos: analisar, compreender, examinar, identificar.]</w:t>
       </w:r>
     </w:p>
     <w:p>
@@ -771,7 +771,7 @@
         <w:jc w:val="both"/>
       </w:pPr>
       <w:r>
-        <w:t>O objetivo geral é analisar a recontextualização da Política Nacional de Educação Digital da Secretaria Municipal de Educação de Tibau do Sul até o contexto da prática da Escola Municipal Domitila Castelo da Silva, considerando a diversidade socioespacial do território municipal, as culturas profissionais e as condições materiais e institucionais da rede e da escola. Os quatro objetivos específicos seguem o funil. O primeiro, na rede municipal, é analisar a recontextualização da PNED pela Secretaria em planos, currículos, formações e orientações, considerando as especificidades das localidades, entre elas as áreas rurais e a comunidade quilombola de Sibaúma. O segundo é compreender a interpretação da política e das orientações municipais pelos profissionais da escola, à luz de suas experiências, crenças e valores. O terceiro é examinar a relação entre as condições materiais e institucionais da escola, articuladas às especificidades de Pipa, e a tradução da política em ações e escolhas cotidianas. O quarto é identificar as formas de atuação produzidas, da adesão à resistência, e suas implicações para a provisão, a proteção e a participação das crianças no ambiente digital.</w:t>
+        <w:t>O objetivo geral é analisar a recontextualização da Política Nacional de Educação Digital da Secretaria Municipal de Educação de Tibau do Sul até o contexto da prática da Escola Municipal Domitila Castelo da Silva, considerando a diversidade socioespacial do território municipal, as culturas profissionais e as condições materiais e institucionais da rede e da escola. Os quatro objetivos específicos seguem o funil. O primeiro faz o caminho do município a Pipa: analisar a recontextualização da PNED pela Secretaria em planos, currículos, formações e orientações, considerando as especificidades das localidades, entre elas as áreas rurais e a comunidade quilombola de Sibaúma, até chegar a Pipa. O segundo é compreender a interpretação da política e das orientações municipais pelos profissionais da escola, à luz de suas experiências, crenças e valores. O terceiro é examinar a relação entre as condições materiais e institucionais da escola, articuladas às especificidades de Pipa, e a tradução da política em ações e escolhas cotidianas. O quarto é identificar as formas de atuação produzidas, da adesão à resistência, e suas implicações para a provisão, a proteção e a participação das crianças no ambiente digital.</w:t>
       </w:r>
     </w:p>
     <w:p>
@@ -796,7 +796,7 @@
         <w:jc w:val="both"/>
       </w:pPr>
       <w:r>
-        <w:t>Vejo cinco relevâncias nesta pesquisa. Para as crianças, porque o eixo lhes promete participação consciente e democrática e proteção dos dados, e nos anos iniciais a escola pode ser o primeiro espaço público em que o digital é discutido com alguém responsável pelo ensino. Para os profissionais, porque olhamos a política a partir de quem a faz acontecer, sem cobrar de cada um o que só o desenho da política poderia garantir. Para o território, porque Tibau do Sul reúne localidades muito distintas numa mesma rede, e em Pipa o uso econômico intenso das tecnologias convive com salas sem telas. Para a ciência, pela leitura da PNED a partir do contexto da prática. E para a rede, que saberá se a tradução municipal da política considera essas diferenças.</w:t>
+        <w:t>Vejo cinco relevâncias nesta pesquisa. Para as crianças, porque o eixo lhes promete participação consciente e democrática e proteção dos dados, e nos anos iniciais a escola pode ser o primeiro espaço público em que o digital é discutido com alguém responsável pelo ensino. Para os profissionais, porque olhamos a política a partir de quem a faz acontecer, sem cobrar de cada um o que só o desenho da política poderia garantir. Para o território, porque Tibau do Sul reúne localidades muito distintas numa mesma rede, e em Pipa o uso econômico intenso das tecnologias convive com salas sem telas. Para a ciência, pela leitura da PNED a partir do contexto da prática. E para a rede, que saberá se a tradução municipal da política considera essas diferenças e o que chega a Pipa.</w:t>
       </w:r>
     </w:p>
     <w:p>
@@ -821,7 +821,7 @@
         <w:jc w:val="both"/>
       </w:pPr>
       <w:r>
-        <w:t>O ineditismo aparece em três planos. No empírico-temporal, acompanhamos a chegada da PNED da Secretaria à escola enquanto ela acontece: a lei é de 2023, a educação digital virou componente curricular no fim daquele ano e a Resolução CNE/CEB nº 2, de 2025, marcou a implementação para 2026, e nenhum dos nove estudos da revisão examina essa política ou uma rede municipal de pequeno porte. No analítico-espacial, o território municipal, de Tibau do Sul a Pipa, entra como parte do contexto, lido com Milton Santos e com Doreen Massey. No teórico-conceitual, articulamos atuação, culturas profissionais, materialidade e território, e daí nasce a formulação habitar o digital.</w:t>
+        <w:t>O ineditismo aparece em três planos. No empírico-temporal, acompanhamos a chegada da PNED a uma escola de Pipa, lida a partir da rede, enquanto ela acontece: a lei é de 2023, a educação digital virou componente curricular no fim daquele ano e a Resolução CNE/CEB nº 2, de 2025, marcou a implementação para 2026, e nenhum dos nove estudos da revisão examina essa política ou uma rede municipal de pequeno porte. No analítico-espacial, Pipa está no centro, lida dentro de um território municipal diverso, com Milton Santos e com Doreen Massey. No teórico-conceitual, articulamos atuação, culturas profissionais, materialidade e território, e daí nasce a formulação habitar o digital.</w:t>
       </w:r>
     </w:p>
     <w:p>
@@ -913,7 +913,7 @@
         <w:jc w:val="both"/>
       </w:pPr>
       <w:r>
-        <w:t>A revisão orientou decisões da tese, e esta lâmina mostra cada uma delas. Os estudos tratam os anos iniciais em bloco e quase não delimitam o ciclo de alfabetização; por isso, a tese delimita o 1º ao 5º ano, com esse ciclo incluído. Nenhum estudo examina a PNED nem uma rede municipal de pequeno porte; a tese toma o eixo Educação Digital Escolar como objeto, da Secretaria de Tibau do Sul à escola. Predominam respostas emergenciais à pandemia; a tese estuda a política no funcionamento ordinário da escola. O corpus mostra que as condições vão além do equipamento e que os profissionais interpretam a política, e daí nasce a pergunta sobre o que eles fazem quando a condição anunciada não chega. Cultura digital e formação cidadã têm apoio frágil, e as crianças não aparecem como sujeitos; o tema será tratado de modo exploratório, ouvindo os profissionais, sem avaliar efeitos sobre as crianças. Por fim, os três eixos da revisão serviram de referência para o questionário e as entrevistas, sem virar categorias fechadas.</w:t>
+        <w:t>A revisão orientou decisões da tese, e esta lâmina mostra cada uma delas. Os estudos tratam os anos iniciais em bloco e quase não delimitam o ciclo de alfabetização; por isso, a tese delimita o 1º ao 5º ano, com esse ciclo incluído. Nenhum estudo examina a PNED nem uma rede municipal de pequeno porte; a tese toma o eixo Educação Digital Escolar como objeto, numa escola de Pipa, lida a partir da rede municipal. Predominam respostas emergenciais à pandemia; a tese estuda a política no funcionamento ordinário da escola. O corpus mostra que as condições vão além do equipamento e que os profissionais interpretam a política, e daí nasce a pergunta sobre o que eles fazem quando a condição anunciada não chega. Cultura digital e formação cidadã têm apoio frágil, e as crianças não aparecem como sujeitos; o tema será tratado de modo exploratório, ouvindo os profissionais, sem avaliar efeitos sobre as crianças. Por fim, os três eixos da revisão serviram de referência para o questionário e as entrevistas, sem virar categorias fechadas.</w:t>
       </w:r>
     </w:p>
     <w:p>
@@ -1097,7 +1097,7 @@
         <w:jc w:val="both"/>
       </w:pPr>
       <w:r>
-        <w:t>A pesquisa é qualitativa e interpretativa, como a define Minayo, e se organiza como estudo de caso único com unidades incorporadas, nos termos de Yin: o caso é a encenação da PNED na rede de Tibau do Sul, e as unidades são a Secretaria e a escola. A análise parte da rede e do território municipal e se estreita até a escola. Não faremos observação de aula, delimitação que Ball, Maguire e Braun também adotaram. Participam um técnico da Secretaria, cuja entrevista abre o campo, e 24 profissionais da escola. A escola tem 351 crianças em quinze turmas, que não participam da produção de dados.</w:t>
+        <w:t>A pesquisa é qualitativa e interpretativa, como a define Minayo, e se organiza como estudo de caso único, nos termos de Yin: o caso é a encenação da PNED na escola de Pipa. O percurso em funil passa pelo território municipal e pelos documentos da Secretaria antes de chegar a Pipa e à escola. Não faremos observação de aula, delimitação que Ball, Maguire e Braun também adotaram. Participam um técnico da Secretaria, cuja entrevista abre o campo, e 24 profissionais da escola. A escola tem 351 crianças em quinze turmas, que não participam da produção de dados.</w:t>
       </w:r>
     </w:p>
     <w:p>
@@ -1324,7 +1324,7 @@
         <w:jc w:val="both"/>
       </w:pPr>
       <w:r>
-        <w:t>Tibau do Sul tem 102 quilômetros quadrados e tinha 16.929 habitantes no Censo de 2022; em 2010, cerca de 40% da população vivia em área rural, dado que ainda vou conferir. O IBGE reconhece só o distrito sede, mas o município se organiza em localidades muito diferentes: a sede, Pipa, Piau, os povoados rurais e Sibaúma, comunidade quilombola certificada pela Fundação Palmares em 2005. A rede tem escolas nesses lugares, e a história delas importa: em Sibaúma, entre 2007 e 2009, a escola recebeu dois computadores que estragaram sem manutenção, e a internet foi desativada, como registra Silva. Segundo o técnico da Secretaria, há um plano elaborado para a rede como um todo. A pergunta é se a tradução municipal da PNED considera essas diferenças.</w:t>
+        <w:t>Tibau do Sul tem 102 quilômetros quadrados e tinha 16.929 habitantes no Censo de 2022; em 2010, cerca de 40% da população vivia em área rural, dado que ainda vou conferir. O IBGE reconhece só o distrito sede, mas o município se organiza em localidades muito diferentes: a sede, Pipa, Piau, os povoados rurais e Sibaúma, comunidade quilombola certificada pela Fundação Palmares em 2005. A rede tem escolas nesses lugares, e a história delas importa: em Sibaúma, entre 2007 e 2009, a escola recebeu dois computadores que estragaram sem manutenção, e a internet foi desativada, como registra Silva. Segundo o técnico da Secretaria, há um plano elaborado para a rede como um todo. A pergunta é se a tradução municipal da PNED considera essas diferenças e o que chega, por esse caminho, a Pipa.</w:t>
       </w:r>
     </w:p>
     <w:p>
@@ -1619,7 +1619,7 @@
         <w:t xml:space="preserve">Por que só uma escola: </w:t>
       </w:r>
       <w:r>
-        <w:t>é um caso único com unidades incorporadas: a rede entra pelos documentos, pelos dados do Censo Escolar e pelo técnico da Secretaria; as outras escolas não são ouvidas, limite declarado no capítulo 4.</w:t>
+        <w:t>Pipa é o foco e o caso; a rede entra pelos documentos, pelos dados do Censo Escolar e pelo técnico da Secretaria; as outras escolas não são ouvidas, limite declarado no capítulo 4.</w:t>
       </w:r>
     </w:p>
     <w:p>

</xml_diff>